<commit_message>
Docs: Se avanzó con el documento de Modelo de Datos hasta la finalización del DER
</commit_message>
<xml_diff>
--- a/03-Elaboración II/Modelo de Datos/Modelo de Datos_MetricFlow SQA_CoDevIT.docx
+++ b/03-Elaboración II/Modelo de Datos/Modelo de Datos_MetricFlow SQA_CoDevIT.docx
@@ -858,35 +858,13 @@
                                   <w:rPr>
                                     <w:color w:val="000000"/>
                                   </w:rPr>
-                                  <w:t xml:space="preserve">Este modelo de datos representa la estructura de los </w:t>
+                                  <w:t xml:space="preserve">Este modelo de datos representa la estructura de los datos  propuesta, sus relaciones, reglas de consistencia y significado dentro del dominio del negocio para el sistema </w:t>
                                 </w:r>
-                                <w:proofErr w:type="gramStart"/>
                                 <w:r>
                                   <w:rPr>
                                     <w:color w:val="000000"/>
                                   </w:rPr>
-                                  <w:t>datos  propuesta</w:t>
-                                </w:r>
-                                <w:proofErr w:type="gramEnd"/>
-                                <w:r>
-                                  <w:rPr>
-                                    <w:color w:val="000000"/>
-                                  </w:rPr>
-                                  <w:t xml:space="preserve">, sus relaciones, reglas de consistencia y significado dentro del dominio del negocio para el sistema </w:t>
-                                </w:r>
-                                <w:proofErr w:type="spellStart"/>
-                                <w:r>
-                                  <w:rPr>
-                                    <w:color w:val="000000"/>
-                                  </w:rPr>
-                                  <w:t>MetricFlow</w:t>
-                                </w:r>
-                                <w:proofErr w:type="spellEnd"/>
-                                <w:r>
-                                  <w:rPr>
-                                    <w:color w:val="000000"/>
-                                  </w:rPr>
-                                  <w:t xml:space="preserve"> SQA. Presenta la interacción entre actores externos y el sistema para definir claramente los requerimientos funcionales, sirviendo como base para el desarrollo y acuerdo entre clientes y desarrolladores. El modelo detalla el comportamiento esperado en la gestión de calidad y métricas para proyectos de software.</w:t>
+                                  <w:t>MetricFlow SQA. Presenta la interacción entre actores externos y el sistema para definir claramente los requerimientos funcionales, sirviendo como base para el desarrollo y acuerdo entre clientes y desarrolladores. El modelo detalla el comportamiento esperado en la gestión de calidad y métricas para proyectos de software.</w:t>
                                 </w:r>
                               </w:p>
                               <w:p>
@@ -968,35 +946,13 @@
                             <w:rPr>
                               <w:color w:val="000000"/>
                             </w:rPr>
-                            <w:t xml:space="preserve">Este modelo de datos representa la estructura de los </w:t>
+                            <w:t xml:space="preserve">Este modelo de datos representa la estructura de los datos  propuesta, sus relaciones, reglas de consistencia y significado dentro del dominio del negocio para el sistema </w:t>
                           </w:r>
-                          <w:proofErr w:type="gramStart"/>
                           <w:r>
                             <w:rPr>
                               <w:color w:val="000000"/>
                             </w:rPr>
-                            <w:t>datos  propuesta</w:t>
-                          </w:r>
-                          <w:proofErr w:type="gramEnd"/>
-                          <w:r>
-                            <w:rPr>
-                              <w:color w:val="000000"/>
-                            </w:rPr>
-                            <w:t xml:space="preserve">, sus relaciones, reglas de consistencia y significado dentro del dominio del negocio para el sistema </w:t>
-                          </w:r>
-                          <w:proofErr w:type="spellStart"/>
-                          <w:r>
-                            <w:rPr>
-                              <w:color w:val="000000"/>
-                            </w:rPr>
-                            <w:t>MetricFlow</w:t>
-                          </w:r>
-                          <w:proofErr w:type="spellEnd"/>
-                          <w:r>
-                            <w:rPr>
-                              <w:color w:val="000000"/>
-                            </w:rPr>
-                            <w:t xml:space="preserve"> SQA. Presenta la interacción entre actores externos y el sistema para definir claramente los requerimientos funcionales, sirviendo como base para el desarrollo y acuerdo entre clientes y desarrolladores. El modelo detalla el comportamiento esperado en la gestión de calidad y métricas para proyectos de software.</w:t>
+                            <w:t>MetricFlow SQA. Presenta la interacción entre actores externos y el sistema para definir claramente los requerimientos funcionales, sirviendo como base para el desarrollo y acuerdo entre clientes y desarrolladores. El modelo detalla el comportamiento esperado en la gestión de calidad y métricas para proyectos de software.</w:t>
                           </w:r>
                         </w:p>
                         <w:p>
@@ -6141,10 +6097,10 @@
         <w:tblLook w:val="04A0" w:firstRow="1" w:lastRow="0" w:firstColumn="1" w:lastColumn="0" w:noHBand="0" w:noVBand="1"/>
       </w:tblPr>
       <w:tblGrid>
-        <w:gridCol w:w="1280"/>
-        <w:gridCol w:w="3399"/>
-        <w:gridCol w:w="3129"/>
-        <w:gridCol w:w="696"/>
+        <w:gridCol w:w="1012"/>
+        <w:gridCol w:w="3525"/>
+        <w:gridCol w:w="3246"/>
+        <w:gridCol w:w="721"/>
       </w:tblGrid>
       <w:tr>
         <w:trPr>
@@ -6559,320 +6515,6 @@
               </w:rPr>
               <w:t>x</w:t>
             </w:r>
-          </w:p>
-        </w:tc>
-      </w:tr>
-      <w:tr>
-        <w:tc>
-          <w:tcPr>
-            <w:tcW w:w="0" w:type="auto"/>
-            <w:tcBorders>
-              <w:top w:val="single" w:sz="8" w:space="0" w:color="000000"/>
-              <w:left w:val="single" w:sz="8" w:space="0" w:color="000000"/>
-              <w:bottom w:val="single" w:sz="8" w:space="0" w:color="000000"/>
-              <w:right w:val="single" w:sz="8" w:space="0" w:color="000000"/>
-            </w:tcBorders>
-            <w:tcMar>
-              <w:top w:w="100" w:type="dxa"/>
-              <w:left w:w="100" w:type="dxa"/>
-              <w:bottom w:w="100" w:type="dxa"/>
-              <w:right w:w="100" w:type="dxa"/>
-            </w:tcMar>
-            <w:hideMark/>
-          </w:tcPr>
-          <w:p>
-            <w:pPr>
-              <w:spacing w:before="0" w:line="240" w:lineRule="auto"/>
-              <w:ind w:left="0"/>
-              <w:rPr>
-                <w:rFonts w:ascii="Times New Roman" w:eastAsia="Times New Roman" w:hAnsi="Times New Roman" w:cs="Times New Roman"/>
-                <w:sz w:val="24"/>
-                <w:szCs w:val="24"/>
-              </w:rPr>
-            </w:pPr>
-            <w:proofErr w:type="spellStart"/>
-            <w:r>
-              <w:rPr>
-                <w:rFonts w:eastAsia="Times New Roman"/>
-                <w:color w:val="000000"/>
-              </w:rPr>
-              <w:t>fecha_inicio</w:t>
-            </w:r>
-            <w:proofErr w:type="spellEnd"/>
-          </w:p>
-        </w:tc>
-        <w:tc>
-          <w:tcPr>
-            <w:tcW w:w="0" w:type="auto"/>
-            <w:tcBorders>
-              <w:top w:val="single" w:sz="8" w:space="0" w:color="000000"/>
-              <w:left w:val="single" w:sz="8" w:space="0" w:color="000000"/>
-              <w:bottom w:val="single" w:sz="8" w:space="0" w:color="000000"/>
-              <w:right w:val="single" w:sz="8" w:space="0" w:color="000000"/>
-            </w:tcBorders>
-            <w:tcMar>
-              <w:top w:w="100" w:type="dxa"/>
-              <w:left w:w="100" w:type="dxa"/>
-              <w:bottom w:w="100" w:type="dxa"/>
-              <w:right w:w="100" w:type="dxa"/>
-            </w:tcMar>
-            <w:hideMark/>
-          </w:tcPr>
-          <w:p>
-            <w:pPr>
-              <w:spacing w:before="0" w:line="240" w:lineRule="auto"/>
-              <w:ind w:left="0"/>
-              <w:rPr>
-                <w:rFonts w:ascii="Times New Roman" w:eastAsia="Times New Roman" w:hAnsi="Times New Roman" w:cs="Times New Roman"/>
-                <w:sz w:val="24"/>
-                <w:szCs w:val="24"/>
-              </w:rPr>
-            </w:pPr>
-            <w:r>
-              <w:rPr>
-                <w:rFonts w:eastAsia="Times New Roman"/>
-                <w:color w:val="000000"/>
-              </w:rPr>
-              <w:t xml:space="preserve">Simple, almacenado, </w:t>
-            </w:r>
-            <w:proofErr w:type="spellStart"/>
-            <w:r>
-              <w:rPr>
-                <w:rFonts w:eastAsia="Times New Roman"/>
-                <w:color w:val="000000"/>
-              </w:rPr>
-              <w:t>monovaluado</w:t>
-            </w:r>
-            <w:proofErr w:type="spellEnd"/>
-            <w:r>
-              <w:rPr>
-                <w:rFonts w:eastAsia="Times New Roman"/>
-                <w:color w:val="000000"/>
-              </w:rPr>
-              <w:t>.</w:t>
-            </w:r>
-          </w:p>
-        </w:tc>
-        <w:tc>
-          <w:tcPr>
-            <w:tcW w:w="0" w:type="auto"/>
-            <w:tcBorders>
-              <w:top w:val="single" w:sz="8" w:space="0" w:color="000000"/>
-              <w:left w:val="single" w:sz="8" w:space="0" w:color="000000"/>
-              <w:bottom w:val="single" w:sz="8" w:space="0" w:color="000000"/>
-              <w:right w:val="single" w:sz="8" w:space="0" w:color="000000"/>
-            </w:tcBorders>
-            <w:tcMar>
-              <w:top w:w="100" w:type="dxa"/>
-              <w:left w:w="100" w:type="dxa"/>
-              <w:bottom w:w="100" w:type="dxa"/>
-              <w:right w:w="100" w:type="dxa"/>
-            </w:tcMar>
-            <w:hideMark/>
-          </w:tcPr>
-          <w:p>
-            <w:pPr>
-              <w:spacing w:before="0" w:line="240" w:lineRule="auto"/>
-              <w:ind w:left="0"/>
-              <w:rPr>
-                <w:rFonts w:ascii="Times New Roman" w:eastAsia="Times New Roman" w:hAnsi="Times New Roman" w:cs="Times New Roman"/>
-                <w:sz w:val="24"/>
-                <w:szCs w:val="24"/>
-              </w:rPr>
-            </w:pPr>
-            <w:r>
-              <w:rPr>
-                <w:rFonts w:eastAsia="Times New Roman"/>
-                <w:color w:val="000000"/>
-              </w:rPr>
-              <w:t>Fecha de inicio de la tarea.</w:t>
-            </w:r>
-          </w:p>
-        </w:tc>
-        <w:tc>
-          <w:tcPr>
-            <w:tcW w:w="0" w:type="auto"/>
-            <w:tcBorders>
-              <w:top w:val="single" w:sz="8" w:space="0" w:color="000000"/>
-              <w:left w:val="single" w:sz="8" w:space="0" w:color="000000"/>
-              <w:bottom w:val="single" w:sz="8" w:space="0" w:color="000000"/>
-              <w:right w:val="single" w:sz="8" w:space="0" w:color="000000"/>
-            </w:tcBorders>
-            <w:tcMar>
-              <w:top w:w="100" w:type="dxa"/>
-              <w:left w:w="100" w:type="dxa"/>
-              <w:bottom w:w="100" w:type="dxa"/>
-              <w:right w:w="100" w:type="dxa"/>
-            </w:tcMar>
-            <w:hideMark/>
-          </w:tcPr>
-          <w:p>
-            <w:pPr>
-              <w:spacing w:before="0" w:line="240" w:lineRule="auto"/>
-              <w:ind w:left="0"/>
-              <w:rPr>
-                <w:rFonts w:ascii="Times New Roman" w:eastAsia="Times New Roman" w:hAnsi="Times New Roman" w:cs="Times New Roman"/>
-                <w:sz w:val="24"/>
-                <w:szCs w:val="24"/>
-              </w:rPr>
-            </w:pPr>
-          </w:p>
-        </w:tc>
-      </w:tr>
-      <w:tr>
-        <w:tc>
-          <w:tcPr>
-            <w:tcW w:w="0" w:type="auto"/>
-            <w:tcBorders>
-              <w:top w:val="single" w:sz="8" w:space="0" w:color="000000"/>
-              <w:left w:val="single" w:sz="8" w:space="0" w:color="000000"/>
-              <w:bottom w:val="single" w:sz="8" w:space="0" w:color="000000"/>
-              <w:right w:val="single" w:sz="8" w:space="0" w:color="000000"/>
-            </w:tcBorders>
-            <w:tcMar>
-              <w:top w:w="100" w:type="dxa"/>
-              <w:left w:w="100" w:type="dxa"/>
-              <w:bottom w:w="100" w:type="dxa"/>
-              <w:right w:w="100" w:type="dxa"/>
-            </w:tcMar>
-            <w:hideMark/>
-          </w:tcPr>
-          <w:p>
-            <w:pPr>
-              <w:spacing w:before="0" w:line="240" w:lineRule="auto"/>
-              <w:ind w:left="0"/>
-              <w:rPr>
-                <w:rFonts w:ascii="Times New Roman" w:eastAsia="Times New Roman" w:hAnsi="Times New Roman" w:cs="Times New Roman"/>
-                <w:sz w:val="24"/>
-                <w:szCs w:val="24"/>
-              </w:rPr>
-            </w:pPr>
-            <w:proofErr w:type="spellStart"/>
-            <w:r>
-              <w:rPr>
-                <w:rFonts w:eastAsia="Times New Roman"/>
-                <w:color w:val="000000"/>
-              </w:rPr>
-              <w:t>fecha_fin</w:t>
-            </w:r>
-            <w:proofErr w:type="spellEnd"/>
-          </w:p>
-        </w:tc>
-        <w:tc>
-          <w:tcPr>
-            <w:tcW w:w="0" w:type="auto"/>
-            <w:tcBorders>
-              <w:top w:val="single" w:sz="8" w:space="0" w:color="000000"/>
-              <w:left w:val="single" w:sz="8" w:space="0" w:color="000000"/>
-              <w:bottom w:val="single" w:sz="8" w:space="0" w:color="000000"/>
-              <w:right w:val="single" w:sz="8" w:space="0" w:color="000000"/>
-            </w:tcBorders>
-            <w:tcMar>
-              <w:top w:w="100" w:type="dxa"/>
-              <w:left w:w="100" w:type="dxa"/>
-              <w:bottom w:w="100" w:type="dxa"/>
-              <w:right w:w="100" w:type="dxa"/>
-            </w:tcMar>
-            <w:hideMark/>
-          </w:tcPr>
-          <w:p>
-            <w:pPr>
-              <w:spacing w:before="0" w:line="240" w:lineRule="auto"/>
-              <w:ind w:left="0"/>
-              <w:rPr>
-                <w:rFonts w:ascii="Times New Roman" w:eastAsia="Times New Roman" w:hAnsi="Times New Roman" w:cs="Times New Roman"/>
-                <w:sz w:val="24"/>
-                <w:szCs w:val="24"/>
-              </w:rPr>
-            </w:pPr>
-            <w:r>
-              <w:rPr>
-                <w:rFonts w:eastAsia="Times New Roman"/>
-                <w:color w:val="000000"/>
-              </w:rPr>
-              <w:t xml:space="preserve">Simple, almacenado, </w:t>
-            </w:r>
-            <w:proofErr w:type="spellStart"/>
-            <w:r>
-              <w:rPr>
-                <w:rFonts w:eastAsia="Times New Roman"/>
-                <w:color w:val="000000"/>
-              </w:rPr>
-              <w:t>monovaluado</w:t>
-            </w:r>
-            <w:proofErr w:type="spellEnd"/>
-            <w:r>
-              <w:rPr>
-                <w:rFonts w:eastAsia="Times New Roman"/>
-                <w:color w:val="000000"/>
-              </w:rPr>
-              <w:t>.</w:t>
-            </w:r>
-          </w:p>
-        </w:tc>
-        <w:tc>
-          <w:tcPr>
-            <w:tcW w:w="0" w:type="auto"/>
-            <w:tcBorders>
-              <w:top w:val="single" w:sz="8" w:space="0" w:color="000000"/>
-              <w:left w:val="single" w:sz="8" w:space="0" w:color="000000"/>
-              <w:bottom w:val="single" w:sz="8" w:space="0" w:color="000000"/>
-              <w:right w:val="single" w:sz="8" w:space="0" w:color="000000"/>
-            </w:tcBorders>
-            <w:tcMar>
-              <w:top w:w="100" w:type="dxa"/>
-              <w:left w:w="100" w:type="dxa"/>
-              <w:bottom w:w="100" w:type="dxa"/>
-              <w:right w:w="100" w:type="dxa"/>
-            </w:tcMar>
-            <w:hideMark/>
-          </w:tcPr>
-          <w:p>
-            <w:pPr>
-              <w:spacing w:before="0" w:line="240" w:lineRule="auto"/>
-              <w:ind w:left="0"/>
-              <w:rPr>
-                <w:rFonts w:ascii="Times New Roman" w:eastAsia="Times New Roman" w:hAnsi="Times New Roman" w:cs="Times New Roman"/>
-                <w:sz w:val="24"/>
-                <w:szCs w:val="24"/>
-              </w:rPr>
-            </w:pPr>
-            <w:r>
-              <w:rPr>
-                <w:rFonts w:eastAsia="Times New Roman"/>
-                <w:color w:val="000000"/>
-              </w:rPr>
-              <w:t>Fecha de fin de la tarea.</w:t>
-            </w:r>
-          </w:p>
-        </w:tc>
-        <w:tc>
-          <w:tcPr>
-            <w:tcW w:w="0" w:type="auto"/>
-            <w:tcBorders>
-              <w:top w:val="single" w:sz="8" w:space="0" w:color="000000"/>
-              <w:left w:val="single" w:sz="8" w:space="0" w:color="000000"/>
-              <w:bottom w:val="single" w:sz="8" w:space="0" w:color="000000"/>
-              <w:right w:val="single" w:sz="8" w:space="0" w:color="000000"/>
-            </w:tcBorders>
-            <w:tcMar>
-              <w:top w:w="100" w:type="dxa"/>
-              <w:left w:w="100" w:type="dxa"/>
-              <w:bottom w:w="100" w:type="dxa"/>
-              <w:right w:w="100" w:type="dxa"/>
-            </w:tcMar>
-            <w:hideMark/>
-          </w:tcPr>
-          <w:p>
-            <w:pPr>
-              <w:spacing w:before="0" w:line="240" w:lineRule="auto"/>
-              <w:ind w:left="0"/>
-              <w:rPr>
-                <w:rFonts w:ascii="Times New Roman" w:eastAsia="Times New Roman" w:hAnsi="Times New Roman" w:cs="Times New Roman"/>
-                <w:sz w:val="24"/>
-                <w:szCs w:val="24"/>
-              </w:rPr>
-            </w:pPr>
           </w:p>
         </w:tc>
       </w:tr>
@@ -8321,44 +7963,6 @@
           <w:szCs w:val="24"/>
         </w:rPr>
       </w:pPr>
-      <w:r>
-        <w:rPr>
-          <w:rFonts w:ascii="Times New Roman" w:eastAsia="Times New Roman" w:hAnsi="Times New Roman" w:cs="Times New Roman"/>
-          <w:sz w:val="24"/>
-          <w:szCs w:val="24"/>
-        </w:rPr>
-        <w:br/>
-      </w:r>
-      <w:r>
-        <w:rPr>
-          <w:rFonts w:ascii="Times New Roman" w:eastAsia="Times New Roman" w:hAnsi="Times New Roman" w:cs="Times New Roman"/>
-          <w:sz w:val="24"/>
-          <w:szCs w:val="24"/>
-        </w:rPr>
-        <w:br/>
-      </w:r>
-    </w:p>
-    <w:p>
-      <w:pPr>
-        <w:spacing w:before="0" w:after="240" w:line="240" w:lineRule="auto"/>
-        <w:ind w:left="0"/>
-        <w:rPr>
-          <w:rFonts w:ascii="Times New Roman" w:eastAsia="Times New Roman" w:hAnsi="Times New Roman" w:cs="Times New Roman"/>
-          <w:sz w:val="24"/>
-          <w:szCs w:val="24"/>
-        </w:rPr>
-      </w:pPr>
-    </w:p>
-    <w:p>
-      <w:pPr>
-        <w:spacing w:before="0" w:after="240" w:line="240" w:lineRule="auto"/>
-        <w:ind w:left="0"/>
-        <w:rPr>
-          <w:rFonts w:ascii="Times New Roman" w:eastAsia="Times New Roman" w:hAnsi="Times New Roman" w:cs="Times New Roman"/>
-          <w:sz w:val="24"/>
-          <w:szCs w:val="24"/>
-        </w:rPr>
-      </w:pPr>
     </w:p>
     <w:tbl>
       <w:tblPr>
@@ -8417,7 +8021,6 @@
                 <w:bCs/>
                 <w:color w:val="000000"/>
               </w:rPr>
-              <w:lastRenderedPageBreak/>
               <w:t>EN07</w:t>
             </w:r>
           </w:p>
@@ -8828,6 +8431,7 @@
                 <w:rFonts w:eastAsia="Times New Roman"/>
                 <w:color w:val="000000"/>
               </w:rPr>
+              <w:lastRenderedPageBreak/>
               <w:t>nombre</w:t>
             </w:r>
           </w:p>
@@ -9273,575 +8877,1351 @@
         <w:t>A continuación, se detallan las relaciones identificadas entre las entidades junto con sus correspondientes cardinalidades:</w:t>
       </w:r>
     </w:p>
-    <w:sdt>
-      <w:sdtPr>
-        <w:tag w:val="goog_rdk_12"/>
-        <w:id w:val="2012577781"/>
-        <w:lock w:val="contentLocked"/>
-      </w:sdtPr>
-      <w:sdtContent>
-        <w:tbl>
-          <w:tblPr>
-            <w:tblStyle w:val="afc"/>
-            <w:tblW w:w="8504" w:type="dxa"/>
-            <w:tblInd w:w="0" w:type="dxa"/>
-            <w:tblBorders>
+    <w:tbl>
+      <w:tblPr>
+        <w:tblW w:w="8504" w:type="dxa"/>
+        <w:tblCellMar>
+          <w:top w:w="15" w:type="dxa"/>
+          <w:left w:w="15" w:type="dxa"/>
+          <w:bottom w:w="15" w:type="dxa"/>
+          <w:right w:w="15" w:type="dxa"/>
+        </w:tblCellMar>
+        <w:tblLook w:val="04A0" w:firstRow="1" w:lastRow="0" w:firstColumn="1" w:lastColumn="0" w:noHBand="0" w:noVBand="1"/>
+      </w:tblPr>
+      <w:tblGrid>
+        <w:gridCol w:w="1197"/>
+        <w:gridCol w:w="2284"/>
+        <w:gridCol w:w="5023"/>
+      </w:tblGrid>
+      <w:tr>
+        <w:trPr>
+          <w:trHeight w:val="404"/>
+        </w:trPr>
+        <w:tc>
+          <w:tcPr>
+            <w:tcW w:w="0" w:type="auto"/>
+            <w:tcBorders>
               <w:top w:val="single" w:sz="8" w:space="0" w:color="000000"/>
               <w:left w:val="single" w:sz="8" w:space="0" w:color="000000"/>
               <w:bottom w:val="single" w:sz="8" w:space="0" w:color="000000"/>
               <w:right w:val="single" w:sz="8" w:space="0" w:color="000000"/>
-              <w:insideH w:val="single" w:sz="8" w:space="0" w:color="000000"/>
-              <w:insideV w:val="single" w:sz="8" w:space="0" w:color="000000"/>
-            </w:tblBorders>
-            <w:tblLayout w:type="fixed"/>
-            <w:tblLook w:val="0600" w:firstRow="0" w:lastRow="0" w:firstColumn="0" w:lastColumn="0" w:noHBand="1" w:noVBand="1"/>
-          </w:tblPr>
-          <w:tblGrid>
-            <w:gridCol w:w="2834"/>
-            <w:gridCol w:w="2835"/>
-            <w:gridCol w:w="2835"/>
-          </w:tblGrid>
-          <w:tr>
-            <w:trPr>
-              <w:trHeight w:val="403"/>
-            </w:trPr>
-            <w:tc>
-              <w:tcPr>
-                <w:tcW w:w="2834" w:type="dxa"/>
-                <w:shd w:val="clear" w:color="auto" w:fill="auto"/>
-                <w:tcMar>
-                  <w:top w:w="100" w:type="dxa"/>
-                  <w:left w:w="100" w:type="dxa"/>
-                  <w:bottom w:w="100" w:type="dxa"/>
-                  <w:right w:w="100" w:type="dxa"/>
-                </w:tcMar>
-              </w:tcPr>
-              <w:p>
-                <w:pPr>
-                  <w:widowControl w:val="0"/>
-                  <w:pBdr>
-                    <w:top w:val="nil"/>
-                    <w:left w:val="nil"/>
-                    <w:bottom w:val="nil"/>
-                    <w:right w:val="nil"/>
-                    <w:between w:val="nil"/>
-                  </w:pBdr>
-                  <w:spacing w:before="0" w:line="240" w:lineRule="auto"/>
-                  <w:ind w:left="0"/>
-                  <w:rPr>
-                    <w:b/>
-                  </w:rPr>
-                </w:pPr>
-                <w:r>
-                  <w:rPr>
-                    <w:b/>
-                  </w:rPr>
-                  <w:t>N° de Relación</w:t>
-                </w:r>
-              </w:p>
-            </w:tc>
-            <w:tc>
-              <w:tcPr>
-                <w:tcW w:w="2834" w:type="dxa"/>
-                <w:shd w:val="clear" w:color="auto" w:fill="auto"/>
-                <w:tcMar>
-                  <w:top w:w="100" w:type="dxa"/>
-                  <w:left w:w="100" w:type="dxa"/>
-                  <w:bottom w:w="100" w:type="dxa"/>
-                  <w:right w:w="100" w:type="dxa"/>
-                </w:tcMar>
-              </w:tcPr>
-              <w:p>
-                <w:pPr>
-                  <w:widowControl w:val="0"/>
-                  <w:pBdr>
-                    <w:top w:val="nil"/>
-                    <w:left w:val="nil"/>
-                    <w:bottom w:val="nil"/>
-                    <w:right w:val="nil"/>
-                    <w:between w:val="nil"/>
-                  </w:pBdr>
-                  <w:spacing w:before="0" w:line="240" w:lineRule="auto"/>
-                  <w:ind w:left="0"/>
-                  <w:rPr>
-                    <w:b/>
-                  </w:rPr>
-                </w:pPr>
-                <w:r>
-                  <w:rPr>
-                    <w:b/>
-                  </w:rPr>
-                  <w:t>Relación</w:t>
-                </w:r>
-              </w:p>
-            </w:tc>
-            <w:tc>
-              <w:tcPr>
-                <w:tcW w:w="2834" w:type="dxa"/>
-                <w:shd w:val="clear" w:color="auto" w:fill="auto"/>
-                <w:tcMar>
-                  <w:top w:w="100" w:type="dxa"/>
-                  <w:left w:w="100" w:type="dxa"/>
-                  <w:bottom w:w="100" w:type="dxa"/>
-                  <w:right w:w="100" w:type="dxa"/>
-                </w:tcMar>
-              </w:tcPr>
-              <w:p>
-                <w:pPr>
-                  <w:widowControl w:val="0"/>
-                  <w:pBdr>
-                    <w:top w:val="nil"/>
-                    <w:left w:val="nil"/>
-                    <w:bottom w:val="nil"/>
-                    <w:right w:val="nil"/>
-                    <w:between w:val="nil"/>
-                  </w:pBdr>
-                  <w:spacing w:before="0" w:line="240" w:lineRule="auto"/>
-                  <w:ind w:left="0"/>
-                  <w:rPr>
-                    <w:b/>
-                  </w:rPr>
-                </w:pPr>
-                <w:r>
-                  <w:rPr>
-                    <w:b/>
-                  </w:rPr>
-                  <w:t>Cardinalidad</w:t>
-                </w:r>
-              </w:p>
-            </w:tc>
-          </w:tr>
-          <w:tr>
-            <w:tc>
-              <w:tcPr>
-                <w:tcW w:w="2834" w:type="dxa"/>
-                <w:shd w:val="clear" w:color="auto" w:fill="auto"/>
-                <w:tcMar>
-                  <w:top w:w="100" w:type="dxa"/>
-                  <w:left w:w="100" w:type="dxa"/>
-                  <w:bottom w:w="100" w:type="dxa"/>
-                  <w:right w:w="100" w:type="dxa"/>
-                </w:tcMar>
-              </w:tcPr>
-              <w:p>
-                <w:pPr>
-                  <w:widowControl w:val="0"/>
-                  <w:pBdr>
-                    <w:top w:val="nil"/>
-                    <w:left w:val="nil"/>
-                    <w:bottom w:val="nil"/>
-                    <w:right w:val="nil"/>
-                    <w:between w:val="nil"/>
-                  </w:pBdr>
-                  <w:spacing w:before="0" w:line="240" w:lineRule="auto"/>
-                  <w:ind w:left="0"/>
-                  <w:rPr>
-                    <w:b/>
-                  </w:rPr>
-                </w:pPr>
-                <w:r>
-                  <w:rPr>
-                    <w:b/>
-                  </w:rPr>
-                  <w:t>Relación 1</w:t>
-                </w:r>
-              </w:p>
-            </w:tc>
-            <w:tc>
-              <w:tcPr>
-                <w:tcW w:w="2834" w:type="dxa"/>
-                <w:shd w:val="clear" w:color="auto" w:fill="auto"/>
-                <w:tcMar>
-                  <w:top w:w="100" w:type="dxa"/>
-                  <w:left w:w="100" w:type="dxa"/>
-                  <w:bottom w:w="100" w:type="dxa"/>
-                  <w:right w:w="100" w:type="dxa"/>
-                </w:tcMar>
-              </w:tcPr>
-              <w:p>
-                <w:pPr>
-                  <w:widowControl w:val="0"/>
-                  <w:pBdr>
-                    <w:top w:val="nil"/>
-                    <w:left w:val="nil"/>
-                    <w:bottom w:val="nil"/>
-                    <w:right w:val="nil"/>
-                    <w:between w:val="nil"/>
-                  </w:pBdr>
-                  <w:spacing w:before="0" w:line="240" w:lineRule="auto"/>
-                  <w:ind w:left="0"/>
-                  <w:rPr>
-                    <w:b/>
-                    <w:i/>
-                  </w:rPr>
-                </w:pPr>
-                <w:r>
-                  <w:t xml:space="preserve">ARTICULO - SECCION </w:t>
-                </w:r>
-                <w:r>
-                  <w:rPr>
-                    <w:b/>
-                    <w:i/>
-                  </w:rPr>
-                  <w:t>agrupa</w:t>
-                </w:r>
-              </w:p>
-            </w:tc>
-            <w:tc>
-              <w:tcPr>
-                <w:tcW w:w="2834" w:type="dxa"/>
-                <w:shd w:val="clear" w:color="auto" w:fill="auto"/>
-                <w:tcMar>
-                  <w:top w:w="100" w:type="dxa"/>
-                  <w:left w:w="100" w:type="dxa"/>
-                  <w:bottom w:w="100" w:type="dxa"/>
-                  <w:right w:w="100" w:type="dxa"/>
-                </w:tcMar>
-              </w:tcPr>
-              <w:p>
-                <w:pPr>
-                  <w:widowControl w:val="0"/>
-                  <w:pBdr>
-                    <w:top w:val="nil"/>
-                    <w:left w:val="nil"/>
-                    <w:bottom w:val="nil"/>
-                    <w:right w:val="nil"/>
-                    <w:between w:val="nil"/>
-                  </w:pBdr>
-                  <w:spacing w:before="0" w:line="240" w:lineRule="auto"/>
-                  <w:ind w:left="0"/>
-                </w:pPr>
-                <w:r>
-                  <w:t>Un artículo se agrupa en una sección, mientras que, una sección agrupa n artículos. (</w:t>
-                </w:r>
-                <w:r>
-                  <w:rPr>
-                    <w:b/>
-                  </w:rPr>
-                  <w:t>1, N</w:t>
-                </w:r>
-                <w:r>
-                  <w:t>).</w:t>
-                </w:r>
-              </w:p>
-            </w:tc>
-          </w:tr>
-          <w:tr>
-            <w:tc>
-              <w:tcPr>
-                <w:tcW w:w="2834" w:type="dxa"/>
-                <w:shd w:val="clear" w:color="auto" w:fill="auto"/>
-                <w:tcMar>
-                  <w:top w:w="100" w:type="dxa"/>
-                  <w:left w:w="100" w:type="dxa"/>
-                  <w:bottom w:w="100" w:type="dxa"/>
-                  <w:right w:w="100" w:type="dxa"/>
-                </w:tcMar>
-              </w:tcPr>
-              <w:p>
-                <w:pPr>
-                  <w:widowControl w:val="0"/>
-                  <w:spacing w:before="0" w:line="240" w:lineRule="auto"/>
-                  <w:ind w:left="0"/>
-                </w:pPr>
-                <w:r>
-                  <w:rPr>
-                    <w:b/>
-                  </w:rPr>
-                  <w:t>Relación 2</w:t>
-                </w:r>
-              </w:p>
-            </w:tc>
-            <w:tc>
-              <w:tcPr>
-                <w:tcW w:w="2834" w:type="dxa"/>
-                <w:shd w:val="clear" w:color="auto" w:fill="auto"/>
-                <w:tcMar>
-                  <w:top w:w="100" w:type="dxa"/>
-                  <w:left w:w="100" w:type="dxa"/>
-                  <w:bottom w:w="100" w:type="dxa"/>
-                  <w:right w:w="100" w:type="dxa"/>
-                </w:tcMar>
-              </w:tcPr>
-              <w:p>
-                <w:pPr>
-                  <w:widowControl w:val="0"/>
-                  <w:pBdr>
-                    <w:top w:val="nil"/>
-                    <w:left w:val="nil"/>
-                    <w:bottom w:val="nil"/>
-                    <w:right w:val="nil"/>
-                    <w:between w:val="nil"/>
-                  </w:pBdr>
-                  <w:spacing w:before="0" w:line="240" w:lineRule="auto"/>
-                  <w:ind w:left="0"/>
-                </w:pPr>
-              </w:p>
-            </w:tc>
-            <w:tc>
-              <w:tcPr>
-                <w:tcW w:w="2834" w:type="dxa"/>
-                <w:shd w:val="clear" w:color="auto" w:fill="auto"/>
-                <w:tcMar>
-                  <w:top w:w="100" w:type="dxa"/>
-                  <w:left w:w="100" w:type="dxa"/>
-                  <w:bottom w:w="100" w:type="dxa"/>
-                  <w:right w:w="100" w:type="dxa"/>
-                </w:tcMar>
-              </w:tcPr>
-              <w:p>
-                <w:pPr>
-                  <w:widowControl w:val="0"/>
-                  <w:pBdr>
-                    <w:top w:val="nil"/>
-                    <w:left w:val="nil"/>
-                    <w:bottom w:val="nil"/>
-                    <w:right w:val="nil"/>
-                    <w:between w:val="nil"/>
-                  </w:pBdr>
-                  <w:spacing w:before="0" w:line="240" w:lineRule="auto"/>
-                  <w:ind w:left="0"/>
-                </w:pPr>
-              </w:p>
-            </w:tc>
-          </w:tr>
-          <w:tr>
-            <w:tc>
-              <w:tcPr>
-                <w:tcW w:w="2834" w:type="dxa"/>
-                <w:shd w:val="clear" w:color="auto" w:fill="auto"/>
-                <w:tcMar>
-                  <w:top w:w="100" w:type="dxa"/>
-                  <w:left w:w="100" w:type="dxa"/>
-                  <w:bottom w:w="100" w:type="dxa"/>
-                  <w:right w:w="100" w:type="dxa"/>
-                </w:tcMar>
-              </w:tcPr>
-              <w:p>
-                <w:pPr>
-                  <w:widowControl w:val="0"/>
-                  <w:spacing w:before="0" w:line="240" w:lineRule="auto"/>
-                  <w:ind w:left="0"/>
-                </w:pPr>
-                <w:r>
-                  <w:rPr>
-                    <w:b/>
-                  </w:rPr>
-                  <w:t>Relación 3</w:t>
-                </w:r>
-              </w:p>
-            </w:tc>
-            <w:tc>
-              <w:tcPr>
-                <w:tcW w:w="2834" w:type="dxa"/>
-                <w:shd w:val="clear" w:color="auto" w:fill="auto"/>
-                <w:tcMar>
-                  <w:top w:w="100" w:type="dxa"/>
-                  <w:left w:w="100" w:type="dxa"/>
-                  <w:bottom w:w="100" w:type="dxa"/>
-                  <w:right w:w="100" w:type="dxa"/>
-                </w:tcMar>
-              </w:tcPr>
-              <w:p>
-                <w:pPr>
-                  <w:widowControl w:val="0"/>
-                  <w:pBdr>
-                    <w:top w:val="nil"/>
-                    <w:left w:val="nil"/>
-                    <w:bottom w:val="nil"/>
-                    <w:right w:val="nil"/>
-                    <w:between w:val="nil"/>
-                  </w:pBdr>
-                  <w:spacing w:before="0" w:line="240" w:lineRule="auto"/>
-                  <w:ind w:left="0"/>
-                </w:pPr>
-              </w:p>
-            </w:tc>
-            <w:tc>
-              <w:tcPr>
-                <w:tcW w:w="2834" w:type="dxa"/>
-                <w:shd w:val="clear" w:color="auto" w:fill="auto"/>
-                <w:tcMar>
-                  <w:top w:w="100" w:type="dxa"/>
-                  <w:left w:w="100" w:type="dxa"/>
-                  <w:bottom w:w="100" w:type="dxa"/>
-                  <w:right w:w="100" w:type="dxa"/>
-                </w:tcMar>
-              </w:tcPr>
-              <w:p>
-                <w:pPr>
-                  <w:widowControl w:val="0"/>
-                  <w:pBdr>
-                    <w:top w:val="nil"/>
-                    <w:left w:val="nil"/>
-                    <w:bottom w:val="nil"/>
-                    <w:right w:val="nil"/>
-                    <w:between w:val="nil"/>
-                  </w:pBdr>
-                  <w:spacing w:before="0" w:line="240" w:lineRule="auto"/>
-                  <w:ind w:left="0"/>
-                </w:pPr>
-              </w:p>
-            </w:tc>
-          </w:tr>
-          <w:tr>
-            <w:tc>
-              <w:tcPr>
-                <w:tcW w:w="2834" w:type="dxa"/>
-                <w:shd w:val="clear" w:color="auto" w:fill="auto"/>
-                <w:tcMar>
-                  <w:top w:w="100" w:type="dxa"/>
-                  <w:left w:w="100" w:type="dxa"/>
-                  <w:bottom w:w="100" w:type="dxa"/>
-                  <w:right w:w="100" w:type="dxa"/>
-                </w:tcMar>
-              </w:tcPr>
-              <w:p>
-                <w:pPr>
-                  <w:widowControl w:val="0"/>
-                  <w:spacing w:before="0" w:line="240" w:lineRule="auto"/>
-                  <w:ind w:left="0"/>
-                </w:pPr>
-                <w:r>
-                  <w:rPr>
-                    <w:b/>
-                  </w:rPr>
-                  <w:t>Relación n</w:t>
-                </w:r>
-              </w:p>
-            </w:tc>
-            <w:tc>
-              <w:tcPr>
-                <w:tcW w:w="2834" w:type="dxa"/>
-                <w:shd w:val="clear" w:color="auto" w:fill="auto"/>
-                <w:tcMar>
-                  <w:top w:w="100" w:type="dxa"/>
-                  <w:left w:w="100" w:type="dxa"/>
-                  <w:bottom w:w="100" w:type="dxa"/>
-                  <w:right w:w="100" w:type="dxa"/>
-                </w:tcMar>
-              </w:tcPr>
-              <w:p>
-                <w:pPr>
-                  <w:widowControl w:val="0"/>
-                  <w:pBdr>
-                    <w:top w:val="nil"/>
-                    <w:left w:val="nil"/>
-                    <w:bottom w:val="nil"/>
-                    <w:right w:val="nil"/>
-                    <w:between w:val="nil"/>
-                  </w:pBdr>
-                  <w:spacing w:before="0" w:line="240" w:lineRule="auto"/>
-                  <w:ind w:left="0"/>
-                </w:pPr>
-              </w:p>
-            </w:tc>
-            <w:tc>
-              <w:tcPr>
-                <w:tcW w:w="2834" w:type="dxa"/>
-                <w:shd w:val="clear" w:color="auto" w:fill="auto"/>
-                <w:tcMar>
-                  <w:top w:w="100" w:type="dxa"/>
-                  <w:left w:w="100" w:type="dxa"/>
-                  <w:bottom w:w="100" w:type="dxa"/>
-                  <w:right w:w="100" w:type="dxa"/>
-                </w:tcMar>
-              </w:tcPr>
-              <w:p>
-                <w:pPr>
-                  <w:widowControl w:val="0"/>
-                  <w:pBdr>
-                    <w:top w:val="nil"/>
-                    <w:left w:val="nil"/>
-                    <w:bottom w:val="nil"/>
-                    <w:right w:val="nil"/>
-                    <w:between w:val="nil"/>
-                  </w:pBdr>
-                  <w:spacing w:before="0" w:line="240" w:lineRule="auto"/>
-                  <w:ind w:left="0"/>
-                </w:pPr>
-              </w:p>
-            </w:tc>
-          </w:tr>
-        </w:tbl>
-      </w:sdtContent>
-    </w:sdt>
-    <w:p>
-      <w:pPr>
-        <w:tabs>
-          <w:tab w:val="left" w:pos="0"/>
-        </w:tabs>
-        <w:spacing w:before="0" w:after="240"/>
+            </w:tcBorders>
+            <w:tcMar>
+              <w:top w:w="100" w:type="dxa"/>
+              <w:left w:w="100" w:type="dxa"/>
+              <w:bottom w:w="100" w:type="dxa"/>
+              <w:right w:w="100" w:type="dxa"/>
+            </w:tcMar>
+            <w:hideMark/>
+          </w:tcPr>
+          <w:p>
+            <w:pPr>
+              <w:spacing w:before="0" w:line="240" w:lineRule="auto"/>
+              <w:ind w:left="0"/>
+              <w:rPr>
+                <w:rFonts w:ascii="Times New Roman" w:eastAsia="Times New Roman" w:hAnsi="Times New Roman" w:cs="Times New Roman"/>
+                <w:sz w:val="24"/>
+                <w:szCs w:val="24"/>
+              </w:rPr>
+            </w:pPr>
+            <w:proofErr w:type="spellStart"/>
+            <w:r>
+              <w:rPr>
+                <w:rFonts w:eastAsia="Times New Roman"/>
+                <w:b/>
+                <w:bCs/>
+                <w:color w:val="000000"/>
+              </w:rPr>
+              <w:t>N°</w:t>
+            </w:r>
+            <w:proofErr w:type="spellEnd"/>
+            <w:r>
+              <w:rPr>
+                <w:rFonts w:eastAsia="Times New Roman"/>
+                <w:b/>
+                <w:bCs/>
+                <w:color w:val="000000"/>
+              </w:rPr>
+              <w:t xml:space="preserve"> de Relación</w:t>
+            </w:r>
+          </w:p>
+        </w:tc>
+        <w:tc>
+          <w:tcPr>
+            <w:tcW w:w="0" w:type="auto"/>
+            <w:tcBorders>
+              <w:top w:val="single" w:sz="8" w:space="0" w:color="000000"/>
+              <w:left w:val="single" w:sz="8" w:space="0" w:color="000000"/>
+              <w:bottom w:val="single" w:sz="8" w:space="0" w:color="000000"/>
+              <w:right w:val="single" w:sz="8" w:space="0" w:color="000000"/>
+            </w:tcBorders>
+            <w:tcMar>
+              <w:top w:w="100" w:type="dxa"/>
+              <w:left w:w="100" w:type="dxa"/>
+              <w:bottom w:w="100" w:type="dxa"/>
+              <w:right w:w="100" w:type="dxa"/>
+            </w:tcMar>
+            <w:hideMark/>
+          </w:tcPr>
+          <w:p>
+            <w:pPr>
+              <w:spacing w:before="0" w:line="240" w:lineRule="auto"/>
+              <w:ind w:left="0"/>
+              <w:rPr>
+                <w:rFonts w:ascii="Times New Roman" w:eastAsia="Times New Roman" w:hAnsi="Times New Roman" w:cs="Times New Roman"/>
+                <w:sz w:val="24"/>
+                <w:szCs w:val="24"/>
+              </w:rPr>
+            </w:pPr>
+            <w:r>
+              <w:rPr>
+                <w:rFonts w:eastAsia="Times New Roman"/>
+                <w:b/>
+                <w:bCs/>
+                <w:color w:val="000000"/>
+              </w:rPr>
+              <w:t>Relación</w:t>
+            </w:r>
+          </w:p>
+        </w:tc>
+        <w:tc>
+          <w:tcPr>
+            <w:tcW w:w="0" w:type="auto"/>
+            <w:tcBorders>
+              <w:top w:val="single" w:sz="8" w:space="0" w:color="000000"/>
+              <w:left w:val="single" w:sz="8" w:space="0" w:color="000000"/>
+              <w:bottom w:val="single" w:sz="8" w:space="0" w:color="000000"/>
+              <w:right w:val="single" w:sz="8" w:space="0" w:color="000000"/>
+            </w:tcBorders>
+            <w:tcMar>
+              <w:top w:w="100" w:type="dxa"/>
+              <w:left w:w="100" w:type="dxa"/>
+              <w:bottom w:w="100" w:type="dxa"/>
+              <w:right w:w="100" w:type="dxa"/>
+            </w:tcMar>
+            <w:hideMark/>
+          </w:tcPr>
+          <w:p>
+            <w:pPr>
+              <w:spacing w:before="0" w:line="240" w:lineRule="auto"/>
+              <w:ind w:left="0"/>
+              <w:rPr>
+                <w:rFonts w:ascii="Times New Roman" w:eastAsia="Times New Roman" w:hAnsi="Times New Roman" w:cs="Times New Roman"/>
+                <w:sz w:val="24"/>
+                <w:szCs w:val="24"/>
+              </w:rPr>
+            </w:pPr>
+            <w:r>
+              <w:rPr>
+                <w:rFonts w:eastAsia="Times New Roman"/>
+                <w:b/>
+                <w:bCs/>
+                <w:color w:val="000000"/>
+              </w:rPr>
+              <w:t>Cardinalidad</w:t>
+            </w:r>
+          </w:p>
+        </w:tc>
+      </w:tr>
+      <w:tr>
+        <w:tc>
+          <w:tcPr>
+            <w:tcW w:w="0" w:type="auto"/>
+            <w:tcBorders>
+              <w:top w:val="single" w:sz="8" w:space="0" w:color="000000"/>
+              <w:left w:val="single" w:sz="8" w:space="0" w:color="000000"/>
+              <w:bottom w:val="single" w:sz="8" w:space="0" w:color="000000"/>
+              <w:right w:val="single" w:sz="8" w:space="0" w:color="000000"/>
+            </w:tcBorders>
+            <w:tcMar>
+              <w:top w:w="100" w:type="dxa"/>
+              <w:left w:w="100" w:type="dxa"/>
+              <w:bottom w:w="100" w:type="dxa"/>
+              <w:right w:w="100" w:type="dxa"/>
+            </w:tcMar>
+            <w:hideMark/>
+          </w:tcPr>
+          <w:p>
+            <w:pPr>
+              <w:spacing w:before="0" w:line="240" w:lineRule="auto"/>
+              <w:ind w:left="0"/>
+              <w:rPr>
+                <w:rFonts w:ascii="Times New Roman" w:eastAsia="Times New Roman" w:hAnsi="Times New Roman" w:cs="Times New Roman"/>
+                <w:sz w:val="24"/>
+                <w:szCs w:val="24"/>
+              </w:rPr>
+            </w:pPr>
+            <w:r>
+              <w:rPr>
+                <w:rFonts w:eastAsia="Times New Roman"/>
+                <w:b/>
+                <w:bCs/>
+                <w:color w:val="000000"/>
+              </w:rPr>
+              <w:t>Relación 1</w:t>
+            </w:r>
+          </w:p>
+        </w:tc>
+        <w:tc>
+          <w:tcPr>
+            <w:tcW w:w="0" w:type="auto"/>
+            <w:tcBorders>
+              <w:top w:val="single" w:sz="8" w:space="0" w:color="000000"/>
+              <w:left w:val="single" w:sz="8" w:space="0" w:color="000000"/>
+              <w:bottom w:val="single" w:sz="8" w:space="0" w:color="000000"/>
+              <w:right w:val="single" w:sz="8" w:space="0" w:color="000000"/>
+            </w:tcBorders>
+            <w:tcMar>
+              <w:top w:w="100" w:type="dxa"/>
+              <w:left w:w="100" w:type="dxa"/>
+              <w:bottom w:w="100" w:type="dxa"/>
+              <w:right w:w="100" w:type="dxa"/>
+            </w:tcMar>
+            <w:hideMark/>
+          </w:tcPr>
+          <w:p>
+            <w:pPr>
+              <w:spacing w:before="0" w:line="240" w:lineRule="auto"/>
+              <w:ind w:left="0"/>
+              <w:rPr>
+                <w:rFonts w:ascii="Times New Roman" w:eastAsia="Times New Roman" w:hAnsi="Times New Roman" w:cs="Times New Roman"/>
+                <w:sz w:val="24"/>
+                <w:szCs w:val="24"/>
+              </w:rPr>
+            </w:pPr>
+            <w:r>
+              <w:rPr>
+                <w:rFonts w:eastAsia="Times New Roman"/>
+                <w:color w:val="000000"/>
+              </w:rPr>
+              <w:t xml:space="preserve">Usuario- Proyecto </w:t>
+            </w:r>
+            <w:proofErr w:type="spellStart"/>
+            <w:r>
+              <w:rPr>
+                <w:rFonts w:eastAsia="Times New Roman"/>
+                <w:b/>
+                <w:bCs/>
+                <w:i/>
+                <w:iCs/>
+                <w:color w:val="000000"/>
+              </w:rPr>
+              <w:t>participa_en</w:t>
+            </w:r>
+            <w:proofErr w:type="spellEnd"/>
+          </w:p>
+        </w:tc>
+        <w:tc>
+          <w:tcPr>
+            <w:tcW w:w="0" w:type="auto"/>
+            <w:tcBorders>
+              <w:top w:val="single" w:sz="8" w:space="0" w:color="000000"/>
+              <w:left w:val="single" w:sz="8" w:space="0" w:color="000000"/>
+              <w:bottom w:val="single" w:sz="8" w:space="0" w:color="000000"/>
+              <w:right w:val="single" w:sz="8" w:space="0" w:color="000000"/>
+            </w:tcBorders>
+            <w:tcMar>
+              <w:top w:w="100" w:type="dxa"/>
+              <w:left w:w="100" w:type="dxa"/>
+              <w:bottom w:w="100" w:type="dxa"/>
+              <w:right w:w="100" w:type="dxa"/>
+            </w:tcMar>
+            <w:hideMark/>
+          </w:tcPr>
+          <w:p>
+            <w:pPr>
+              <w:spacing w:before="0" w:line="240" w:lineRule="auto"/>
+              <w:ind w:left="0"/>
+              <w:rPr>
+                <w:rFonts w:ascii="Times New Roman" w:eastAsia="Times New Roman" w:hAnsi="Times New Roman" w:cs="Times New Roman"/>
+                <w:sz w:val="24"/>
+                <w:szCs w:val="24"/>
+              </w:rPr>
+            </w:pPr>
+            <w:r>
+              <w:rPr>
+                <w:rFonts w:eastAsia="Times New Roman"/>
+                <w:color w:val="000000"/>
+              </w:rPr>
+              <w:t>Un usuario participa  en varios proyectos, mientras que, un proyecto posee varios usuarios (</w:t>
+            </w:r>
+            <w:r>
+              <w:rPr>
+                <w:rFonts w:eastAsia="Times New Roman"/>
+                <w:b/>
+                <w:bCs/>
+                <w:color w:val="000000"/>
+              </w:rPr>
+              <w:t>N, M</w:t>
+            </w:r>
+            <w:r>
+              <w:rPr>
+                <w:rFonts w:eastAsia="Times New Roman"/>
+                <w:color w:val="000000"/>
+              </w:rPr>
+              <w:t>).</w:t>
+            </w:r>
+          </w:p>
+        </w:tc>
+      </w:tr>
+      <w:tr>
+        <w:tc>
+          <w:tcPr>
+            <w:tcW w:w="0" w:type="auto"/>
+            <w:tcBorders>
+              <w:top w:val="single" w:sz="8" w:space="0" w:color="000000"/>
+              <w:left w:val="single" w:sz="8" w:space="0" w:color="000000"/>
+              <w:bottom w:val="single" w:sz="8" w:space="0" w:color="000000"/>
+              <w:right w:val="single" w:sz="8" w:space="0" w:color="000000"/>
+            </w:tcBorders>
+            <w:tcMar>
+              <w:top w:w="100" w:type="dxa"/>
+              <w:left w:w="100" w:type="dxa"/>
+              <w:bottom w:w="100" w:type="dxa"/>
+              <w:right w:w="100" w:type="dxa"/>
+            </w:tcMar>
+            <w:hideMark/>
+          </w:tcPr>
+          <w:p>
+            <w:pPr>
+              <w:spacing w:before="0" w:line="240" w:lineRule="auto"/>
+              <w:ind w:left="0"/>
+              <w:rPr>
+                <w:rFonts w:ascii="Times New Roman" w:eastAsia="Times New Roman" w:hAnsi="Times New Roman" w:cs="Times New Roman"/>
+                <w:sz w:val="24"/>
+                <w:szCs w:val="24"/>
+              </w:rPr>
+            </w:pPr>
+            <w:r>
+              <w:rPr>
+                <w:rFonts w:eastAsia="Times New Roman"/>
+                <w:b/>
+                <w:bCs/>
+                <w:color w:val="000000"/>
+              </w:rPr>
+              <w:t>Relación 2</w:t>
+            </w:r>
+          </w:p>
+        </w:tc>
+        <w:tc>
+          <w:tcPr>
+            <w:tcW w:w="0" w:type="auto"/>
+            <w:tcBorders>
+              <w:top w:val="single" w:sz="8" w:space="0" w:color="000000"/>
+              <w:left w:val="single" w:sz="8" w:space="0" w:color="000000"/>
+              <w:bottom w:val="single" w:sz="8" w:space="0" w:color="000000"/>
+              <w:right w:val="single" w:sz="8" w:space="0" w:color="000000"/>
+            </w:tcBorders>
+            <w:tcMar>
+              <w:top w:w="100" w:type="dxa"/>
+              <w:left w:w="100" w:type="dxa"/>
+              <w:bottom w:w="100" w:type="dxa"/>
+              <w:right w:w="100" w:type="dxa"/>
+            </w:tcMar>
+            <w:hideMark/>
+          </w:tcPr>
+          <w:p>
+            <w:pPr>
+              <w:spacing w:before="0" w:line="240" w:lineRule="auto"/>
+              <w:ind w:left="0"/>
+              <w:rPr>
+                <w:rFonts w:ascii="Times New Roman" w:eastAsia="Times New Roman" w:hAnsi="Times New Roman" w:cs="Times New Roman"/>
+                <w:sz w:val="24"/>
+                <w:szCs w:val="24"/>
+              </w:rPr>
+            </w:pPr>
+            <w:r>
+              <w:rPr>
+                <w:rFonts w:eastAsia="Times New Roman"/>
+                <w:color w:val="000000"/>
+              </w:rPr>
+              <w:t>Proyecto-</w:t>
+            </w:r>
+            <w:proofErr w:type="spellStart"/>
+            <w:r>
+              <w:rPr>
+                <w:rFonts w:eastAsia="Times New Roman"/>
+                <w:color w:val="000000"/>
+              </w:rPr>
+              <w:t>Modelo_Calidad</w:t>
+            </w:r>
+            <w:proofErr w:type="spellEnd"/>
+            <w:r>
+              <w:rPr>
+                <w:rFonts w:eastAsia="Times New Roman"/>
+                <w:color w:val="000000"/>
+              </w:rPr>
+              <w:t xml:space="preserve"> </w:t>
+            </w:r>
+            <w:r>
+              <w:rPr>
+                <w:rFonts w:eastAsia="Times New Roman"/>
+                <w:b/>
+                <w:bCs/>
+                <w:i/>
+                <w:iCs/>
+                <w:color w:val="000000"/>
+              </w:rPr>
+              <w:t>aplica</w:t>
+            </w:r>
+          </w:p>
+        </w:tc>
+        <w:tc>
+          <w:tcPr>
+            <w:tcW w:w="0" w:type="auto"/>
+            <w:tcBorders>
+              <w:top w:val="single" w:sz="8" w:space="0" w:color="000000"/>
+              <w:left w:val="single" w:sz="8" w:space="0" w:color="000000"/>
+              <w:bottom w:val="single" w:sz="8" w:space="0" w:color="000000"/>
+              <w:right w:val="single" w:sz="8" w:space="0" w:color="000000"/>
+            </w:tcBorders>
+            <w:tcMar>
+              <w:top w:w="100" w:type="dxa"/>
+              <w:left w:w="100" w:type="dxa"/>
+              <w:bottom w:w="100" w:type="dxa"/>
+              <w:right w:w="100" w:type="dxa"/>
+            </w:tcMar>
+            <w:hideMark/>
+          </w:tcPr>
+          <w:p>
+            <w:pPr>
+              <w:spacing w:before="0" w:line="240" w:lineRule="auto"/>
+              <w:ind w:left="0"/>
+              <w:rPr>
+                <w:rFonts w:ascii="Times New Roman" w:eastAsia="Times New Roman" w:hAnsi="Times New Roman" w:cs="Times New Roman"/>
+                <w:sz w:val="24"/>
+                <w:szCs w:val="24"/>
+              </w:rPr>
+            </w:pPr>
+            <w:r>
+              <w:rPr>
+                <w:rFonts w:eastAsia="Times New Roman"/>
+                <w:color w:val="000000"/>
+              </w:rPr>
+              <w:t>Un proyecto aplica un modelo de calidad, mientras que, un modelo de calidad es aplicado por varios proyectos (</w:t>
+            </w:r>
+            <w:r>
+              <w:rPr>
+                <w:rFonts w:eastAsia="Times New Roman"/>
+                <w:b/>
+                <w:bCs/>
+                <w:color w:val="000000"/>
+              </w:rPr>
+              <w:t>1,N</w:t>
+            </w:r>
+            <w:r>
+              <w:rPr>
+                <w:rFonts w:eastAsia="Times New Roman"/>
+                <w:color w:val="000000"/>
+              </w:rPr>
+              <w:t>).</w:t>
+            </w:r>
+          </w:p>
+        </w:tc>
+      </w:tr>
+      <w:tr>
+        <w:tc>
+          <w:tcPr>
+            <w:tcW w:w="0" w:type="auto"/>
+            <w:tcBorders>
+              <w:top w:val="single" w:sz="8" w:space="0" w:color="000000"/>
+              <w:left w:val="single" w:sz="8" w:space="0" w:color="000000"/>
+              <w:bottom w:val="single" w:sz="8" w:space="0" w:color="000000"/>
+              <w:right w:val="single" w:sz="8" w:space="0" w:color="000000"/>
+            </w:tcBorders>
+            <w:tcMar>
+              <w:top w:w="100" w:type="dxa"/>
+              <w:left w:w="100" w:type="dxa"/>
+              <w:bottom w:w="100" w:type="dxa"/>
+              <w:right w:w="100" w:type="dxa"/>
+            </w:tcMar>
+            <w:hideMark/>
+          </w:tcPr>
+          <w:p>
+            <w:pPr>
+              <w:spacing w:before="0" w:line="240" w:lineRule="auto"/>
+              <w:ind w:left="0"/>
+              <w:rPr>
+                <w:rFonts w:ascii="Times New Roman" w:eastAsia="Times New Roman" w:hAnsi="Times New Roman" w:cs="Times New Roman"/>
+                <w:sz w:val="24"/>
+                <w:szCs w:val="24"/>
+              </w:rPr>
+            </w:pPr>
+            <w:r>
+              <w:rPr>
+                <w:rFonts w:eastAsia="Times New Roman"/>
+                <w:b/>
+                <w:bCs/>
+                <w:color w:val="000000"/>
+              </w:rPr>
+              <w:t>Relación 3</w:t>
+            </w:r>
+          </w:p>
+        </w:tc>
+        <w:tc>
+          <w:tcPr>
+            <w:tcW w:w="0" w:type="auto"/>
+            <w:tcBorders>
+              <w:top w:val="single" w:sz="8" w:space="0" w:color="000000"/>
+              <w:left w:val="single" w:sz="8" w:space="0" w:color="000000"/>
+              <w:bottom w:val="single" w:sz="8" w:space="0" w:color="000000"/>
+              <w:right w:val="single" w:sz="8" w:space="0" w:color="000000"/>
+            </w:tcBorders>
+            <w:tcMar>
+              <w:top w:w="100" w:type="dxa"/>
+              <w:left w:w="100" w:type="dxa"/>
+              <w:bottom w:w="100" w:type="dxa"/>
+              <w:right w:w="100" w:type="dxa"/>
+            </w:tcMar>
+            <w:hideMark/>
+          </w:tcPr>
+          <w:p>
+            <w:pPr>
+              <w:spacing w:before="0" w:line="240" w:lineRule="auto"/>
+              <w:ind w:left="0"/>
+              <w:rPr>
+                <w:rFonts w:ascii="Times New Roman" w:eastAsia="Times New Roman" w:hAnsi="Times New Roman" w:cs="Times New Roman"/>
+                <w:sz w:val="24"/>
+                <w:szCs w:val="24"/>
+              </w:rPr>
+            </w:pPr>
+            <w:proofErr w:type="spellStart"/>
+            <w:r>
+              <w:rPr>
+                <w:rFonts w:eastAsia="Times New Roman"/>
+                <w:color w:val="000000"/>
+              </w:rPr>
+              <w:t>Modelo_Calidad-Metrica</w:t>
+            </w:r>
+            <w:proofErr w:type="spellEnd"/>
+            <w:r>
+              <w:rPr>
+                <w:rFonts w:eastAsia="Times New Roman"/>
+                <w:color w:val="000000"/>
+              </w:rPr>
+              <w:t xml:space="preserve">  </w:t>
+            </w:r>
+            <w:r>
+              <w:rPr>
+                <w:rFonts w:eastAsia="Times New Roman"/>
+                <w:b/>
+                <w:bCs/>
+                <w:i/>
+                <w:iCs/>
+                <w:color w:val="000000"/>
+              </w:rPr>
+              <w:t>posee</w:t>
+            </w:r>
+          </w:p>
+        </w:tc>
+        <w:tc>
+          <w:tcPr>
+            <w:tcW w:w="0" w:type="auto"/>
+            <w:tcBorders>
+              <w:top w:val="single" w:sz="8" w:space="0" w:color="000000"/>
+              <w:left w:val="single" w:sz="8" w:space="0" w:color="000000"/>
+              <w:bottom w:val="single" w:sz="8" w:space="0" w:color="000000"/>
+              <w:right w:val="single" w:sz="8" w:space="0" w:color="000000"/>
+            </w:tcBorders>
+            <w:tcMar>
+              <w:top w:w="100" w:type="dxa"/>
+              <w:left w:w="100" w:type="dxa"/>
+              <w:bottom w:w="100" w:type="dxa"/>
+              <w:right w:w="100" w:type="dxa"/>
+            </w:tcMar>
+            <w:hideMark/>
+          </w:tcPr>
+          <w:p>
+            <w:pPr>
+              <w:spacing w:before="0" w:line="240" w:lineRule="auto"/>
+              <w:ind w:left="0"/>
+              <w:rPr>
+                <w:rFonts w:ascii="Times New Roman" w:eastAsia="Times New Roman" w:hAnsi="Times New Roman" w:cs="Times New Roman"/>
+                <w:sz w:val="24"/>
+                <w:szCs w:val="24"/>
+              </w:rPr>
+            </w:pPr>
+            <w:r>
+              <w:rPr>
+                <w:rFonts w:eastAsia="Times New Roman"/>
+                <w:color w:val="000000"/>
+              </w:rPr>
+              <w:t>Un modelo de calidad posee varias métricas, mientras que, una métrica está en varios modelos (</w:t>
+            </w:r>
+            <w:r>
+              <w:rPr>
+                <w:rFonts w:eastAsia="Times New Roman"/>
+                <w:b/>
+                <w:bCs/>
+                <w:color w:val="000000"/>
+              </w:rPr>
+              <w:t>N, M</w:t>
+            </w:r>
+            <w:r>
+              <w:rPr>
+                <w:rFonts w:eastAsia="Times New Roman"/>
+                <w:color w:val="000000"/>
+              </w:rPr>
+              <w:t>).</w:t>
+            </w:r>
+          </w:p>
+        </w:tc>
+      </w:tr>
+      <w:tr>
+        <w:tc>
+          <w:tcPr>
+            <w:tcW w:w="0" w:type="auto"/>
+            <w:tcBorders>
+              <w:top w:val="single" w:sz="8" w:space="0" w:color="000000"/>
+              <w:left w:val="single" w:sz="8" w:space="0" w:color="000000"/>
+              <w:bottom w:val="single" w:sz="8" w:space="0" w:color="000000"/>
+              <w:right w:val="single" w:sz="8" w:space="0" w:color="000000"/>
+            </w:tcBorders>
+            <w:tcMar>
+              <w:top w:w="100" w:type="dxa"/>
+              <w:left w:w="100" w:type="dxa"/>
+              <w:bottom w:w="100" w:type="dxa"/>
+              <w:right w:w="100" w:type="dxa"/>
+            </w:tcMar>
+            <w:hideMark/>
+          </w:tcPr>
+          <w:p>
+            <w:pPr>
+              <w:spacing w:before="0" w:line="240" w:lineRule="auto"/>
+              <w:ind w:left="0"/>
+              <w:rPr>
+                <w:rFonts w:ascii="Times New Roman" w:eastAsia="Times New Roman" w:hAnsi="Times New Roman" w:cs="Times New Roman"/>
+                <w:sz w:val="24"/>
+                <w:szCs w:val="24"/>
+              </w:rPr>
+            </w:pPr>
+            <w:r>
+              <w:rPr>
+                <w:rFonts w:eastAsia="Times New Roman"/>
+                <w:b/>
+                <w:bCs/>
+                <w:color w:val="000000"/>
+              </w:rPr>
+              <w:t>Relación 4</w:t>
+            </w:r>
+          </w:p>
+        </w:tc>
+        <w:tc>
+          <w:tcPr>
+            <w:tcW w:w="0" w:type="auto"/>
+            <w:tcBorders>
+              <w:top w:val="single" w:sz="8" w:space="0" w:color="000000"/>
+              <w:left w:val="single" w:sz="8" w:space="0" w:color="000000"/>
+              <w:bottom w:val="single" w:sz="8" w:space="0" w:color="000000"/>
+              <w:right w:val="single" w:sz="8" w:space="0" w:color="000000"/>
+            </w:tcBorders>
+            <w:tcMar>
+              <w:top w:w="100" w:type="dxa"/>
+              <w:left w:w="100" w:type="dxa"/>
+              <w:bottom w:w="100" w:type="dxa"/>
+              <w:right w:w="100" w:type="dxa"/>
+            </w:tcMar>
+            <w:hideMark/>
+          </w:tcPr>
+          <w:p>
+            <w:pPr>
+              <w:spacing w:before="0" w:line="240" w:lineRule="auto"/>
+              <w:ind w:left="0"/>
+              <w:rPr>
+                <w:rFonts w:ascii="Times New Roman" w:eastAsia="Times New Roman" w:hAnsi="Times New Roman" w:cs="Times New Roman"/>
+                <w:sz w:val="24"/>
+                <w:szCs w:val="24"/>
+              </w:rPr>
+            </w:pPr>
+            <w:proofErr w:type="spellStart"/>
+            <w:r>
+              <w:rPr>
+                <w:rFonts w:eastAsia="Times New Roman"/>
+                <w:color w:val="000000"/>
+              </w:rPr>
+              <w:t>Metrica</w:t>
+            </w:r>
+            <w:proofErr w:type="spellEnd"/>
+            <w:r>
+              <w:rPr>
+                <w:rFonts w:eastAsia="Times New Roman"/>
+                <w:color w:val="000000"/>
+              </w:rPr>
+              <w:t>-Tarea </w:t>
+            </w:r>
+          </w:p>
+          <w:p>
+            <w:pPr>
+              <w:spacing w:before="0" w:line="240" w:lineRule="auto"/>
+              <w:ind w:left="0"/>
+              <w:rPr>
+                <w:rFonts w:ascii="Times New Roman" w:eastAsia="Times New Roman" w:hAnsi="Times New Roman" w:cs="Times New Roman"/>
+                <w:sz w:val="24"/>
+                <w:szCs w:val="24"/>
+              </w:rPr>
+            </w:pPr>
+            <w:proofErr w:type="spellStart"/>
+            <w:r>
+              <w:rPr>
+                <w:rFonts w:eastAsia="Times New Roman"/>
+                <w:b/>
+                <w:bCs/>
+                <w:i/>
+                <w:iCs/>
+                <w:color w:val="000000"/>
+              </w:rPr>
+              <w:t>se_vincula_con</w:t>
+            </w:r>
+            <w:proofErr w:type="spellEnd"/>
+          </w:p>
+        </w:tc>
+        <w:tc>
+          <w:tcPr>
+            <w:tcW w:w="0" w:type="auto"/>
+            <w:tcBorders>
+              <w:top w:val="single" w:sz="8" w:space="0" w:color="000000"/>
+              <w:left w:val="single" w:sz="8" w:space="0" w:color="000000"/>
+              <w:bottom w:val="single" w:sz="8" w:space="0" w:color="000000"/>
+              <w:right w:val="single" w:sz="8" w:space="0" w:color="000000"/>
+            </w:tcBorders>
+            <w:tcMar>
+              <w:top w:w="100" w:type="dxa"/>
+              <w:left w:w="100" w:type="dxa"/>
+              <w:bottom w:w="100" w:type="dxa"/>
+              <w:right w:w="100" w:type="dxa"/>
+            </w:tcMar>
+            <w:hideMark/>
+          </w:tcPr>
+          <w:p>
+            <w:pPr>
+              <w:spacing w:before="0" w:line="240" w:lineRule="auto"/>
+              <w:ind w:left="0"/>
+              <w:rPr>
+                <w:rFonts w:ascii="Times New Roman" w:eastAsia="Times New Roman" w:hAnsi="Times New Roman" w:cs="Times New Roman"/>
+                <w:sz w:val="24"/>
+                <w:szCs w:val="24"/>
+              </w:rPr>
+            </w:pPr>
+            <w:r>
+              <w:rPr>
+                <w:rFonts w:eastAsia="Times New Roman"/>
+                <w:color w:val="000000"/>
+              </w:rPr>
+              <w:t>Una métrica se vincula con varias tareas, mientras que, una tarea está vinculada a varias métricas (</w:t>
+            </w:r>
+            <w:r>
+              <w:rPr>
+                <w:rFonts w:eastAsia="Times New Roman"/>
+                <w:b/>
+                <w:bCs/>
+                <w:color w:val="000000"/>
+              </w:rPr>
+              <w:t>N, M</w:t>
+            </w:r>
+            <w:r>
+              <w:rPr>
+                <w:rFonts w:eastAsia="Times New Roman"/>
+                <w:color w:val="000000"/>
+              </w:rPr>
+              <w:t>).</w:t>
+            </w:r>
+          </w:p>
+        </w:tc>
+      </w:tr>
+      <w:tr>
+        <w:tc>
+          <w:tcPr>
+            <w:tcW w:w="0" w:type="auto"/>
+            <w:tcBorders>
+              <w:top w:val="single" w:sz="8" w:space="0" w:color="000000"/>
+              <w:left w:val="single" w:sz="8" w:space="0" w:color="000000"/>
+              <w:bottom w:val="single" w:sz="8" w:space="0" w:color="000000"/>
+              <w:right w:val="single" w:sz="8" w:space="0" w:color="000000"/>
+            </w:tcBorders>
+            <w:tcMar>
+              <w:top w:w="100" w:type="dxa"/>
+              <w:left w:w="100" w:type="dxa"/>
+              <w:bottom w:w="100" w:type="dxa"/>
+              <w:right w:w="100" w:type="dxa"/>
+            </w:tcMar>
+            <w:hideMark/>
+          </w:tcPr>
+          <w:p>
+            <w:pPr>
+              <w:spacing w:before="0" w:line="240" w:lineRule="auto"/>
+              <w:ind w:left="0"/>
+              <w:rPr>
+                <w:rFonts w:ascii="Times New Roman" w:eastAsia="Times New Roman" w:hAnsi="Times New Roman" w:cs="Times New Roman"/>
+                <w:sz w:val="24"/>
+                <w:szCs w:val="24"/>
+              </w:rPr>
+            </w:pPr>
+            <w:r>
+              <w:rPr>
+                <w:rFonts w:eastAsia="Times New Roman"/>
+                <w:b/>
+                <w:bCs/>
+                <w:color w:val="000000"/>
+              </w:rPr>
+              <w:t>Relación 5</w:t>
+            </w:r>
+          </w:p>
+        </w:tc>
+        <w:tc>
+          <w:tcPr>
+            <w:tcW w:w="0" w:type="auto"/>
+            <w:tcBorders>
+              <w:top w:val="single" w:sz="8" w:space="0" w:color="000000"/>
+              <w:left w:val="single" w:sz="8" w:space="0" w:color="000000"/>
+              <w:bottom w:val="single" w:sz="8" w:space="0" w:color="000000"/>
+              <w:right w:val="single" w:sz="8" w:space="0" w:color="000000"/>
+            </w:tcBorders>
+            <w:tcMar>
+              <w:top w:w="100" w:type="dxa"/>
+              <w:left w:w="100" w:type="dxa"/>
+              <w:bottom w:w="100" w:type="dxa"/>
+              <w:right w:w="100" w:type="dxa"/>
+            </w:tcMar>
+            <w:hideMark/>
+          </w:tcPr>
+          <w:p>
+            <w:pPr>
+              <w:spacing w:before="0" w:line="240" w:lineRule="auto"/>
+              <w:ind w:left="0"/>
+              <w:rPr>
+                <w:rFonts w:ascii="Times New Roman" w:eastAsia="Times New Roman" w:hAnsi="Times New Roman" w:cs="Times New Roman"/>
+                <w:sz w:val="24"/>
+                <w:szCs w:val="24"/>
+              </w:rPr>
+            </w:pPr>
+            <w:r>
+              <w:rPr>
+                <w:rFonts w:eastAsia="Times New Roman"/>
+                <w:color w:val="000000"/>
+              </w:rPr>
+              <w:t xml:space="preserve">Proyecto-Fase </w:t>
+            </w:r>
+            <w:r>
+              <w:rPr>
+                <w:rFonts w:eastAsia="Times New Roman"/>
+                <w:b/>
+                <w:bCs/>
+                <w:i/>
+                <w:iCs/>
+                <w:color w:val="000000"/>
+              </w:rPr>
+              <w:t>posee</w:t>
+            </w:r>
+          </w:p>
+        </w:tc>
+        <w:tc>
+          <w:tcPr>
+            <w:tcW w:w="0" w:type="auto"/>
+            <w:tcBorders>
+              <w:top w:val="single" w:sz="8" w:space="0" w:color="000000"/>
+              <w:left w:val="single" w:sz="8" w:space="0" w:color="000000"/>
+              <w:bottom w:val="single" w:sz="8" w:space="0" w:color="000000"/>
+              <w:right w:val="single" w:sz="8" w:space="0" w:color="000000"/>
+            </w:tcBorders>
+            <w:tcMar>
+              <w:top w:w="100" w:type="dxa"/>
+              <w:left w:w="100" w:type="dxa"/>
+              <w:bottom w:w="100" w:type="dxa"/>
+              <w:right w:w="100" w:type="dxa"/>
+            </w:tcMar>
+            <w:hideMark/>
+          </w:tcPr>
+          <w:p>
+            <w:pPr>
+              <w:spacing w:before="0" w:line="240" w:lineRule="auto"/>
+              <w:ind w:left="0"/>
+              <w:rPr>
+                <w:rFonts w:ascii="Times New Roman" w:eastAsia="Times New Roman" w:hAnsi="Times New Roman" w:cs="Times New Roman"/>
+                <w:sz w:val="24"/>
+                <w:szCs w:val="24"/>
+              </w:rPr>
+            </w:pPr>
+            <w:r>
+              <w:rPr>
+                <w:rFonts w:eastAsia="Times New Roman"/>
+                <w:color w:val="000000"/>
+              </w:rPr>
+              <w:t>Un proyecto posee varias fases, mientras que, una fase está en varios proyectos (</w:t>
+            </w:r>
+            <w:r>
+              <w:rPr>
+                <w:rFonts w:eastAsia="Times New Roman"/>
+                <w:b/>
+                <w:bCs/>
+                <w:color w:val="000000"/>
+              </w:rPr>
+              <w:t>N, M</w:t>
+            </w:r>
+            <w:r>
+              <w:rPr>
+                <w:rFonts w:eastAsia="Times New Roman"/>
+                <w:color w:val="000000"/>
+              </w:rPr>
+              <w:t>).</w:t>
+            </w:r>
+          </w:p>
+        </w:tc>
+      </w:tr>
+      <w:tr>
+        <w:tc>
+          <w:tcPr>
+            <w:tcW w:w="0" w:type="auto"/>
+            <w:tcBorders>
+              <w:top w:val="single" w:sz="8" w:space="0" w:color="000000"/>
+              <w:left w:val="single" w:sz="8" w:space="0" w:color="000000"/>
+              <w:bottom w:val="single" w:sz="8" w:space="0" w:color="000000"/>
+              <w:right w:val="single" w:sz="8" w:space="0" w:color="000000"/>
+            </w:tcBorders>
+            <w:tcMar>
+              <w:top w:w="100" w:type="dxa"/>
+              <w:left w:w="100" w:type="dxa"/>
+              <w:bottom w:w="100" w:type="dxa"/>
+              <w:right w:w="100" w:type="dxa"/>
+            </w:tcMar>
+            <w:hideMark/>
+          </w:tcPr>
+          <w:p>
+            <w:pPr>
+              <w:spacing w:before="0" w:line="240" w:lineRule="auto"/>
+              <w:ind w:left="0"/>
+              <w:rPr>
+                <w:rFonts w:ascii="Times New Roman" w:eastAsia="Times New Roman" w:hAnsi="Times New Roman" w:cs="Times New Roman"/>
+                <w:sz w:val="24"/>
+                <w:szCs w:val="24"/>
+              </w:rPr>
+            </w:pPr>
+            <w:r>
+              <w:rPr>
+                <w:rFonts w:eastAsia="Times New Roman"/>
+                <w:b/>
+                <w:bCs/>
+                <w:color w:val="000000"/>
+              </w:rPr>
+              <w:t>Relación 6</w:t>
+            </w:r>
+          </w:p>
+        </w:tc>
+        <w:tc>
+          <w:tcPr>
+            <w:tcW w:w="0" w:type="auto"/>
+            <w:tcBorders>
+              <w:top w:val="single" w:sz="8" w:space="0" w:color="000000"/>
+              <w:left w:val="single" w:sz="8" w:space="0" w:color="000000"/>
+              <w:bottom w:val="single" w:sz="8" w:space="0" w:color="000000"/>
+              <w:right w:val="single" w:sz="8" w:space="0" w:color="000000"/>
+            </w:tcBorders>
+            <w:tcMar>
+              <w:top w:w="100" w:type="dxa"/>
+              <w:left w:w="100" w:type="dxa"/>
+              <w:bottom w:w="100" w:type="dxa"/>
+              <w:right w:w="100" w:type="dxa"/>
+            </w:tcMar>
+            <w:hideMark/>
+          </w:tcPr>
+          <w:p>
+            <w:pPr>
+              <w:spacing w:before="0" w:line="240" w:lineRule="auto"/>
+              <w:ind w:left="0"/>
+              <w:rPr>
+                <w:rFonts w:ascii="Times New Roman" w:eastAsia="Times New Roman" w:hAnsi="Times New Roman" w:cs="Times New Roman"/>
+                <w:sz w:val="24"/>
+                <w:szCs w:val="24"/>
+              </w:rPr>
+            </w:pPr>
+            <w:r>
+              <w:rPr>
+                <w:rFonts w:eastAsia="Times New Roman"/>
+                <w:color w:val="000000"/>
+              </w:rPr>
+              <w:t>Fase-</w:t>
+            </w:r>
+            <w:proofErr w:type="spellStart"/>
+            <w:r>
+              <w:rPr>
+                <w:rFonts w:eastAsia="Times New Roman"/>
+                <w:color w:val="000000"/>
+              </w:rPr>
+              <w:t>Iteracion</w:t>
+            </w:r>
+            <w:proofErr w:type="spellEnd"/>
+            <w:r>
+              <w:rPr>
+                <w:rFonts w:eastAsia="Times New Roman"/>
+                <w:color w:val="000000"/>
+              </w:rPr>
+              <w:t xml:space="preserve"> </w:t>
+            </w:r>
+            <w:r>
+              <w:rPr>
+                <w:rFonts w:eastAsia="Times New Roman"/>
+                <w:b/>
+                <w:bCs/>
+                <w:i/>
+                <w:iCs/>
+                <w:color w:val="000000"/>
+              </w:rPr>
+              <w:t>posee</w:t>
+            </w:r>
+          </w:p>
+        </w:tc>
+        <w:tc>
+          <w:tcPr>
+            <w:tcW w:w="0" w:type="auto"/>
+            <w:tcBorders>
+              <w:top w:val="single" w:sz="8" w:space="0" w:color="000000"/>
+              <w:left w:val="single" w:sz="8" w:space="0" w:color="000000"/>
+              <w:bottom w:val="single" w:sz="8" w:space="0" w:color="000000"/>
+              <w:right w:val="single" w:sz="8" w:space="0" w:color="000000"/>
+            </w:tcBorders>
+            <w:tcMar>
+              <w:top w:w="100" w:type="dxa"/>
+              <w:left w:w="100" w:type="dxa"/>
+              <w:bottom w:w="100" w:type="dxa"/>
+              <w:right w:w="100" w:type="dxa"/>
+            </w:tcMar>
+            <w:hideMark/>
+          </w:tcPr>
+          <w:p>
+            <w:pPr>
+              <w:spacing w:before="0" w:line="240" w:lineRule="auto"/>
+              <w:ind w:left="0"/>
+              <w:rPr>
+                <w:rFonts w:ascii="Times New Roman" w:eastAsia="Times New Roman" w:hAnsi="Times New Roman" w:cs="Times New Roman"/>
+                <w:sz w:val="24"/>
+                <w:szCs w:val="24"/>
+              </w:rPr>
+            </w:pPr>
+            <w:r>
+              <w:rPr>
+                <w:rFonts w:eastAsia="Times New Roman"/>
+                <w:color w:val="000000"/>
+              </w:rPr>
+              <w:t>Una fase posee varias iteraciones, mientras que, una iteración está en una fase (</w:t>
+            </w:r>
+            <w:r>
+              <w:rPr>
+                <w:rFonts w:eastAsia="Times New Roman"/>
+                <w:b/>
+                <w:bCs/>
+                <w:color w:val="000000"/>
+              </w:rPr>
+              <w:t>1,N</w:t>
+            </w:r>
+            <w:r>
+              <w:rPr>
+                <w:rFonts w:eastAsia="Times New Roman"/>
+                <w:color w:val="000000"/>
+              </w:rPr>
+              <w:t>).</w:t>
+            </w:r>
+          </w:p>
+        </w:tc>
+      </w:tr>
+      <w:tr>
+        <w:tc>
+          <w:tcPr>
+            <w:tcW w:w="0" w:type="auto"/>
+            <w:tcBorders>
+              <w:top w:val="single" w:sz="8" w:space="0" w:color="000000"/>
+              <w:left w:val="single" w:sz="8" w:space="0" w:color="000000"/>
+              <w:bottom w:val="single" w:sz="8" w:space="0" w:color="000000"/>
+              <w:right w:val="single" w:sz="8" w:space="0" w:color="000000"/>
+            </w:tcBorders>
+            <w:tcMar>
+              <w:top w:w="100" w:type="dxa"/>
+              <w:left w:w="100" w:type="dxa"/>
+              <w:bottom w:w="100" w:type="dxa"/>
+              <w:right w:w="100" w:type="dxa"/>
+            </w:tcMar>
+            <w:hideMark/>
+          </w:tcPr>
+          <w:p>
+            <w:pPr>
+              <w:spacing w:before="0" w:line="240" w:lineRule="auto"/>
+              <w:ind w:left="0"/>
+              <w:rPr>
+                <w:rFonts w:ascii="Times New Roman" w:eastAsia="Times New Roman" w:hAnsi="Times New Roman" w:cs="Times New Roman"/>
+                <w:sz w:val="24"/>
+                <w:szCs w:val="24"/>
+              </w:rPr>
+            </w:pPr>
+            <w:r>
+              <w:rPr>
+                <w:rFonts w:eastAsia="Times New Roman"/>
+                <w:b/>
+                <w:bCs/>
+                <w:color w:val="000000"/>
+              </w:rPr>
+              <w:lastRenderedPageBreak/>
+              <w:t>Relación 7</w:t>
+            </w:r>
+          </w:p>
+        </w:tc>
+        <w:tc>
+          <w:tcPr>
+            <w:tcW w:w="0" w:type="auto"/>
+            <w:tcBorders>
+              <w:top w:val="single" w:sz="8" w:space="0" w:color="000000"/>
+              <w:left w:val="single" w:sz="8" w:space="0" w:color="000000"/>
+              <w:bottom w:val="single" w:sz="8" w:space="0" w:color="000000"/>
+              <w:right w:val="single" w:sz="8" w:space="0" w:color="000000"/>
+            </w:tcBorders>
+            <w:tcMar>
+              <w:top w:w="100" w:type="dxa"/>
+              <w:left w:w="100" w:type="dxa"/>
+              <w:bottom w:w="100" w:type="dxa"/>
+              <w:right w:w="100" w:type="dxa"/>
+            </w:tcMar>
+            <w:hideMark/>
+          </w:tcPr>
+          <w:p>
+            <w:pPr>
+              <w:spacing w:before="0" w:line="240" w:lineRule="auto"/>
+              <w:ind w:left="0"/>
+              <w:rPr>
+                <w:rFonts w:ascii="Times New Roman" w:eastAsia="Times New Roman" w:hAnsi="Times New Roman" w:cs="Times New Roman"/>
+                <w:sz w:val="24"/>
+                <w:szCs w:val="24"/>
+              </w:rPr>
+            </w:pPr>
+            <w:r>
+              <w:rPr>
+                <w:rFonts w:eastAsia="Times New Roman"/>
+                <w:color w:val="000000"/>
+              </w:rPr>
+              <w:t xml:space="preserve">Iteración-Tarea </w:t>
+            </w:r>
+            <w:r>
+              <w:rPr>
+                <w:rFonts w:eastAsia="Times New Roman"/>
+                <w:b/>
+                <w:bCs/>
+                <w:i/>
+                <w:iCs/>
+                <w:color w:val="000000"/>
+              </w:rPr>
+              <w:t>contiene</w:t>
+            </w:r>
+          </w:p>
+        </w:tc>
+        <w:tc>
+          <w:tcPr>
+            <w:tcW w:w="0" w:type="auto"/>
+            <w:tcBorders>
+              <w:top w:val="single" w:sz="8" w:space="0" w:color="000000"/>
+              <w:left w:val="single" w:sz="8" w:space="0" w:color="000000"/>
+              <w:bottom w:val="single" w:sz="8" w:space="0" w:color="000000"/>
+              <w:right w:val="single" w:sz="8" w:space="0" w:color="000000"/>
+            </w:tcBorders>
+            <w:tcMar>
+              <w:top w:w="100" w:type="dxa"/>
+              <w:left w:w="100" w:type="dxa"/>
+              <w:bottom w:w="100" w:type="dxa"/>
+              <w:right w:w="100" w:type="dxa"/>
+            </w:tcMar>
+            <w:hideMark/>
+          </w:tcPr>
+          <w:p>
+            <w:pPr>
+              <w:spacing w:before="0" w:line="240" w:lineRule="auto"/>
+              <w:ind w:left="0"/>
+              <w:rPr>
+                <w:rFonts w:ascii="Times New Roman" w:eastAsia="Times New Roman" w:hAnsi="Times New Roman" w:cs="Times New Roman"/>
+                <w:sz w:val="24"/>
+                <w:szCs w:val="24"/>
+              </w:rPr>
+            </w:pPr>
+            <w:r>
+              <w:rPr>
+                <w:rFonts w:eastAsia="Times New Roman"/>
+                <w:color w:val="000000"/>
+              </w:rPr>
+              <w:t>Una iteración contiene varias tareas, mientras que, una tarea es contenida por varias iteraciones.</w:t>
+            </w:r>
+          </w:p>
+        </w:tc>
+      </w:tr>
+    </w:tbl>
+    <w:p>
+      <w:pPr>
+        <w:spacing w:before="0" w:after="240" w:line="240" w:lineRule="auto"/>
         <w:ind w:left="0"/>
         <w:jc w:val="center"/>
-      </w:pPr>
-      <w:r>
-        <w:t>Tabla X. Descripción de las relaciones identificadas</w:t>
-      </w:r>
-    </w:p>
-    <w:p>
-      <w:pPr>
-        <w:pStyle w:val="Ttulo2"/>
-      </w:pPr>
-      <w:bookmarkStart w:id="9" w:name="_heading=h.i0kmubdk1zl1" w:colFirst="0" w:colLast="0"/>
-      <w:bookmarkEnd w:id="9"/>
-      <w:r>
-        <w:lastRenderedPageBreak/>
+        <w:rPr>
+          <w:rFonts w:ascii="Times New Roman" w:eastAsia="Times New Roman" w:hAnsi="Times New Roman" w:cs="Times New Roman"/>
+          <w:sz w:val="24"/>
+          <w:szCs w:val="24"/>
+        </w:rPr>
+      </w:pPr>
+      <w:r>
+        <w:rPr>
+          <w:rFonts w:eastAsia="Times New Roman"/>
+          <w:color w:val="000000"/>
+        </w:rPr>
+        <w:t>Tabla 8. Descripción de las relaciones identificadas</w:t>
+      </w:r>
+    </w:p>
+    <w:p>
+      <w:pPr>
+        <w:spacing w:line="240" w:lineRule="auto"/>
+        <w:ind w:left="0" w:hanging="357"/>
+        <w:outlineLvl w:val="1"/>
+        <w:rPr>
+          <w:rFonts w:ascii="Times New Roman" w:eastAsia="Times New Roman" w:hAnsi="Times New Roman" w:cs="Times New Roman"/>
+          <w:b/>
+          <w:bCs/>
+          <w:sz w:val="36"/>
+          <w:szCs w:val="36"/>
+        </w:rPr>
+      </w:pPr>
+      <w:r>
+        <w:rPr>
+          <w:rFonts w:ascii="Cambria" w:eastAsia="Times New Roman" w:hAnsi="Cambria" w:cs="Times New Roman"/>
+          <w:b/>
+          <w:bCs/>
+          <w:color w:val="4F81BD"/>
+          <w:sz w:val="26"/>
+          <w:szCs w:val="26"/>
+        </w:rPr>
         <w:t>Diagrama E-R</w:t>
       </w:r>
     </w:p>
     <w:p>
       <w:pPr>
-        <w:tabs>
-          <w:tab w:val="left" w:pos="0"/>
-        </w:tabs>
-        <w:spacing w:after="240"/>
+        <w:spacing w:after="240" w:line="240" w:lineRule="auto"/>
         <w:ind w:left="0"/>
         <w:jc w:val="both"/>
-      </w:pPr>
-      <w:r>
+        <w:rPr>
+          <w:rFonts w:ascii="Times New Roman" w:eastAsia="Times New Roman" w:hAnsi="Times New Roman" w:cs="Times New Roman"/>
+          <w:sz w:val="24"/>
+          <w:szCs w:val="24"/>
+        </w:rPr>
+      </w:pPr>
+      <w:r>
+        <w:rPr>
+          <w:rFonts w:eastAsia="Times New Roman"/>
+          <w:color w:val="000000"/>
+        </w:rPr>
         <w:t>El Diagrama E-R es un tipo de diagrama de flujo que ilustra cómo las "entidades", como personas, objetos o conceptos, se relacionan entre sí dentro de un sistema.</w:t>
       </w:r>
     </w:p>
     <w:p>
       <w:pPr>
-        <w:tabs>
-          <w:tab w:val="left" w:pos="0"/>
-        </w:tabs>
-        <w:spacing w:after="240"/>
+        <w:spacing w:after="240" w:line="240" w:lineRule="auto"/>
         <w:ind w:left="0"/>
         <w:jc w:val="both"/>
-      </w:pPr>
-      <w:r>
-        <w:t>De acuerdo con la información especificada anteriormente, utilizamos la herramienta “Draw.io” para realizar dicho diagrama.</w:t>
-      </w:r>
-    </w:p>
-    <w:p>
-      <w:pPr>
-        <w:tabs>
-          <w:tab w:val="left" w:pos="0"/>
-        </w:tabs>
-        <w:spacing w:after="240"/>
+        <w:rPr>
+          <w:rFonts w:ascii="Times New Roman" w:eastAsia="Times New Roman" w:hAnsi="Times New Roman" w:cs="Times New Roman"/>
+          <w:sz w:val="24"/>
+          <w:szCs w:val="24"/>
+        </w:rPr>
+      </w:pPr>
+      <w:r>
+        <w:rPr>
+          <w:rFonts w:eastAsia="Times New Roman"/>
+          <w:color w:val="000000"/>
+        </w:rPr>
+        <w:t>De acuerdo con la información especificada anteriormente, utilizamos la herramienta “Dia” para realizar dicho diagrama.</w:t>
+      </w:r>
+    </w:p>
+    <w:p>
+      <w:pPr>
+        <w:spacing w:after="240" w:line="240" w:lineRule="auto"/>
         <w:ind w:left="0"/>
         <w:jc w:val="both"/>
         <w:rPr>
-          <w:highlight w:val="yellow"/>
-        </w:rPr>
-      </w:pPr>
-      <w:r>
-        <w:rPr>
-          <w:highlight w:val="yellow"/>
-        </w:rPr>
-        <w:t>(FOTO DEL DIAGRAMA)</w:t>
+          <w:rFonts w:ascii="Times New Roman" w:eastAsia="Times New Roman" w:hAnsi="Times New Roman" w:cs="Times New Roman"/>
+          <w:sz w:val="24"/>
+          <w:szCs w:val="24"/>
+        </w:rPr>
+      </w:pPr>
+      <w:r>
+        <w:rPr>
+          <w:rFonts w:eastAsia="Times New Roman"/>
+          <w:noProof/>
+          <w:color w:val="000000"/>
+          <w:bdr w:val="none" w:sz="0" w:space="0" w:color="auto" w:frame="1"/>
+        </w:rPr>
+        <w:drawing>
+          <wp:inline distT="0" distB="0" distL="0" distR="0" wp14:anchorId="5F8B3144" wp14:editId="79EDDF68">
+            <wp:extent cx="6278880" cy="4686300"/>
+            <wp:effectExtent l="0" t="0" r="7620" b="0"/>
+            <wp:docPr id="4" name="Imagen 4"/>
+            <wp:cNvGraphicFramePr>
+              <a:graphicFrameLocks xmlns:a="http://schemas.openxmlformats.org/drawingml/2006/main" noChangeAspect="1"/>
+            </wp:cNvGraphicFramePr>
+            <a:graphic xmlns:a="http://schemas.openxmlformats.org/drawingml/2006/main">
+              <a:graphicData uri="http://schemas.openxmlformats.org/drawingml/2006/picture">
+                <pic:pic xmlns:pic="http://schemas.openxmlformats.org/drawingml/2006/picture">
+                  <pic:nvPicPr>
+                    <pic:cNvPr id="0" name="Picture 4"/>
+                    <pic:cNvPicPr>
+                      <a:picLocks noChangeAspect="1" noChangeArrowheads="1"/>
+                    </pic:cNvPicPr>
+                  </pic:nvPicPr>
+                  <pic:blipFill>
+                    <a:blip r:embed="rId11">
+                      <a:extLst>
+                        <a:ext uri="{28A0092B-C50C-407E-A947-70E740481C1C}">
+                          <a14:useLocalDpi xmlns:a14="http://schemas.microsoft.com/office/drawing/2010/main" val="0"/>
+                        </a:ext>
+                      </a:extLst>
+                    </a:blip>
+                    <a:srcRect/>
+                    <a:stretch>
+                      <a:fillRect/>
+                    </a:stretch>
+                  </pic:blipFill>
+                  <pic:spPr bwMode="auto">
+                    <a:xfrm>
+                      <a:off x="0" y="0"/>
+                      <a:ext cx="6278880" cy="4686300"/>
+                    </a:xfrm>
+                    <a:prstGeom prst="rect">
+                      <a:avLst/>
+                    </a:prstGeom>
+                    <a:noFill/>
+                    <a:ln>
+                      <a:noFill/>
+                    </a:ln>
+                  </pic:spPr>
+                </pic:pic>
+              </a:graphicData>
+            </a:graphic>
+          </wp:inline>
+        </w:drawing>
+      </w:r>
+    </w:p>
+    <w:p>
+      <w:pPr>
+        <w:spacing w:before="0" w:after="240" w:line="240" w:lineRule="auto"/>
+        <w:ind w:left="0"/>
+        <w:jc w:val="center"/>
+        <w:rPr>
+          <w:rFonts w:ascii="Times New Roman" w:eastAsia="Times New Roman" w:hAnsi="Times New Roman" w:cs="Times New Roman"/>
+          <w:sz w:val="24"/>
+          <w:szCs w:val="24"/>
+        </w:rPr>
+      </w:pPr>
+      <w:r>
+        <w:rPr>
+          <w:rFonts w:eastAsia="Times New Roman"/>
+          <w:color w:val="000000"/>
+        </w:rPr>
+        <w:t>Ilustración 1. Diagrama Entidad Relación</w:t>
       </w:r>
     </w:p>
     <w:p>
       <w:pPr>
         <w:pStyle w:val="Ttulo3"/>
       </w:pPr>
-      <w:bookmarkStart w:id="10" w:name="_heading=h.1d8iomc55sej" w:colFirst="0" w:colLast="0"/>
-      <w:bookmarkEnd w:id="10"/>
-      <w:r>
+      <w:r>
+        <w:lastRenderedPageBreak/>
         <w:t>Notación diagrama E-R</w:t>
       </w:r>
     </w:p>
@@ -9867,7 +10247,7 @@
                     <pic:cNvPicPr preferRelativeResize="0"/>
                   </pic:nvPicPr>
                   <pic:blipFill>
-                    <a:blip r:embed="rId11"/>
+                    <a:blip r:embed="rId12"/>
                     <a:srcRect b="29100"/>
                     <a:stretch>
                       <a:fillRect/>
@@ -9921,8 +10301,8 @@
       <w:pPr>
         <w:pStyle w:val="Ttulo2"/>
       </w:pPr>
-      <w:bookmarkStart w:id="11" w:name="_heading=h.kccvwc8bm901" w:colFirst="0" w:colLast="0"/>
-      <w:bookmarkEnd w:id="11"/>
+      <w:bookmarkStart w:id="9" w:name="_heading=h.kccvwc8bm901" w:colFirst="0" w:colLast="0"/>
+      <w:bookmarkEnd w:id="9"/>
       <w:r>
         <w:t>Modelo Relacional</w:t>
       </w:r>
@@ -9976,7 +10356,6 @@
         <w:rPr>
           <w:b/>
         </w:rPr>
-        <w:lastRenderedPageBreak/>
         <w:t>Tuplas</w:t>
       </w:r>
       <w:r>
@@ -10083,7 +10462,11 @@
         <w:t>Foránea (FK)</w:t>
       </w:r>
       <w:r>
-        <w:t>: Es un conjunto de atributos de una relación que hace referencia a la clave primaria de otra relación (o la misma). Cada componente de una FK debe estar definido sobre el mismo dominio que el correspondiente atributo de la PK a la que referencia.</w:t>
+        <w:t xml:space="preserve">: Es un conjunto de atributos de una relación que hace referencia a la clave primaria de otra relación (o la misma). Cada componente de una FK </w:t>
+      </w:r>
+      <w:r>
+        <w:lastRenderedPageBreak/>
+        <w:t>debe estar definido sobre el mismo dominio que el correspondiente atributo de la PK a la que referencia.</w:t>
       </w:r>
     </w:p>
     <w:p>
@@ -10175,8 +10558,8 @@
       <w:pPr>
         <w:pStyle w:val="Ttulo2"/>
       </w:pPr>
-      <w:bookmarkStart w:id="12" w:name="_heading=h.c9trlfwvbkxy" w:colFirst="0" w:colLast="0"/>
-      <w:bookmarkEnd w:id="12"/>
+      <w:bookmarkStart w:id="10" w:name="_heading=h.c9trlfwvbkxy" w:colFirst="0" w:colLast="0"/>
+      <w:bookmarkEnd w:id="10"/>
       <w:r>
         <w:t xml:space="preserve">Mapeo de las Entidades fuertes y </w:t>
       </w:r>
@@ -10567,8 +10950,8 @@
           <w:color w:val="548DD4"/>
         </w:rPr>
       </w:pPr>
-      <w:bookmarkStart w:id="13" w:name="_heading=h.1z7a196voiq1" w:colFirst="0" w:colLast="0"/>
-      <w:bookmarkEnd w:id="13"/>
+      <w:bookmarkStart w:id="11" w:name="_heading=h.1z7a196voiq1" w:colFirst="0" w:colLast="0"/>
+      <w:bookmarkEnd w:id="11"/>
       <w:r>
         <w:t>Mapeo de las Relaciones 1:1</w:t>
       </w:r>
@@ -10603,7 +10986,6 @@
         <w:jc w:val="both"/>
       </w:pPr>
       <w:r>
-        <w:lastRenderedPageBreak/>
         <w:t>Proyecto(</w:t>
       </w:r>
       <w:proofErr w:type="spellStart"/>
@@ -10784,6 +11166,7 @@
       </w:pPr>
       <w:proofErr w:type="spellStart"/>
       <w:r>
+        <w:lastRenderedPageBreak/>
         <w:t>Iteracion</w:t>
       </w:r>
       <w:proofErr w:type="spellEnd"/>
@@ -10961,8 +11344,8 @@
       <w:pPr>
         <w:pStyle w:val="Ttulo2"/>
       </w:pPr>
-      <w:bookmarkStart w:id="14" w:name="_heading=h.e1mix8erk8wx" w:colFirst="0" w:colLast="0"/>
-      <w:bookmarkEnd w:id="14"/>
+      <w:bookmarkStart w:id="12" w:name="_heading=h.e1mix8erk8wx" w:colFirst="0" w:colLast="0"/>
+      <w:bookmarkEnd w:id="12"/>
       <w:r>
         <w:t>Mapeo de las Relaciones 1:N</w:t>
       </w:r>
@@ -11569,8 +11952,8 @@
       <w:pPr>
         <w:pStyle w:val="Ttulo2"/>
       </w:pPr>
-      <w:bookmarkStart w:id="15" w:name="_heading=h.r1ego3hmn0ye" w:colFirst="0" w:colLast="0"/>
-      <w:bookmarkEnd w:id="15"/>
+      <w:bookmarkStart w:id="13" w:name="_heading=h.r1ego3hmn0ye" w:colFirst="0" w:colLast="0"/>
+      <w:bookmarkEnd w:id="13"/>
       <w:r>
         <w:t>Mapeo de las Relaciones N:M</w:t>
       </w:r>
@@ -11605,7 +11988,6 @@
         <w:jc w:val="both"/>
       </w:pPr>
       <w:r>
-        <w:lastRenderedPageBreak/>
         <w:t>Proyecto(</w:t>
       </w:r>
       <w:proofErr w:type="spellStart"/>
@@ -11822,6 +12204,7 @@
       </w:pPr>
       <w:proofErr w:type="spellStart"/>
       <w:r>
+        <w:lastRenderedPageBreak/>
         <w:t>Iteracion</w:t>
       </w:r>
       <w:proofErr w:type="spellEnd"/>
@@ -12369,8 +12752,8 @@
       <w:pPr>
         <w:pStyle w:val="Ttulo2"/>
       </w:pPr>
-      <w:bookmarkStart w:id="16" w:name="_heading=h.ix6ac8m7du10" w:colFirst="0" w:colLast="0"/>
-      <w:bookmarkEnd w:id="16"/>
+      <w:bookmarkStart w:id="14" w:name="_heading=h.ix6ac8m7du10" w:colFirst="0" w:colLast="0"/>
+      <w:bookmarkEnd w:id="14"/>
       <w:r>
         <w:t>Normalización</w:t>
       </w:r>
@@ -12434,7 +12817,6 @@
         <w:jc w:val="both"/>
       </w:pPr>
       <w:r>
-        <w:lastRenderedPageBreak/>
         <w:t>Por lo que, una vez que hemos creado las tablas hay que verificarlas y revisar si aún se puede reducir u optimizar de alguna manera.</w:t>
       </w:r>
     </w:p>
@@ -12468,6 +12850,7 @@
         <w:rPr>
           <w:b/>
         </w:rPr>
+        <w:lastRenderedPageBreak/>
         <w:t>1° Forma Normal (1FN)</w:t>
       </w:r>
       <w:r>
@@ -12562,8 +12945,8 @@
       <w:pPr>
         <w:pStyle w:val="Ttulo3"/>
       </w:pPr>
-      <w:bookmarkStart w:id="17" w:name="_heading=h.qdmuasvcgdy2" w:colFirst="0" w:colLast="0"/>
-      <w:bookmarkEnd w:id="17"/>
+      <w:bookmarkStart w:id="15" w:name="_heading=h.qdmuasvcgdy2" w:colFirst="0" w:colLast="0"/>
+      <w:bookmarkEnd w:id="15"/>
       <w:r>
         <w:t>Dependencias funcionales</w:t>
       </w:r>
@@ -13011,7 +13394,6 @@
         <w:ind w:left="0"/>
       </w:pPr>
       <w:r>
-        <w:lastRenderedPageBreak/>
         <w:t>La segunda forma normal la cumple ya que todos los atributos tienen dependencia funcional sobre la clave primaria.</w:t>
       </w:r>
     </w:p>
@@ -13028,9 +13410,10 @@
       <w:pPr>
         <w:pStyle w:val="Ttulo2"/>
       </w:pPr>
-      <w:bookmarkStart w:id="18" w:name="_heading=h.uhnyifgvykyf" w:colFirst="0" w:colLast="0"/>
-      <w:bookmarkEnd w:id="18"/>
-      <w:r>
+      <w:bookmarkStart w:id="16" w:name="_heading=h.uhnyifgvykyf" w:colFirst="0" w:colLast="0"/>
+      <w:bookmarkEnd w:id="16"/>
+      <w:r>
+        <w:lastRenderedPageBreak/>
         <w:t>Justificación de Forma normal adoptada</w:t>
       </w:r>
     </w:p>
@@ -13122,8 +13505,8 @@
           <w:szCs w:val="26"/>
         </w:rPr>
       </w:pPr>
-      <w:bookmarkStart w:id="19" w:name="_heading=h.kclsonkky4td" w:colFirst="0" w:colLast="0"/>
-      <w:bookmarkEnd w:id="19"/>
+      <w:bookmarkStart w:id="17" w:name="_heading=h.kclsonkky4td" w:colFirst="0" w:colLast="0"/>
+      <w:bookmarkEnd w:id="17"/>
       <w:r>
         <w:rPr>
           <w:rFonts w:ascii="Cambria" w:eastAsia="Cambria" w:hAnsi="Cambria" w:cs="Cambria"/>
@@ -13210,15 +13593,7 @@
       </w:r>
       <w:proofErr w:type="spellEnd"/>
       <w:r>
-        <w:t xml:space="preserve"> se </w:t>
-      </w:r>
-      <w:proofErr w:type="gramStart"/>
-      <w:r>
-        <w:t>utilizaran</w:t>
-      </w:r>
-      <w:proofErr w:type="gramEnd"/>
-      <w:r>
-        <w:t xml:space="preserve"> en claves foráneas y su formato para las tablas principales (tablas del modelo entidad y relación) es </w:t>
+        <w:t xml:space="preserve"> se utilizaran en claves foráneas y su formato para las tablas principales (tablas del modelo entidad y relación) es </w:t>
       </w:r>
       <w:proofErr w:type="spellStart"/>
       <w:r>
@@ -13258,8 +13633,8 @@
       </w:pPr>
     </w:p>
     <w:sectPr>
-      <w:headerReference w:type="default" r:id="rId12"/>
-      <w:footerReference w:type="default" r:id="rId13"/>
+      <w:headerReference w:type="default" r:id="rId13"/>
+      <w:footerReference w:type="default" r:id="rId14"/>
       <w:pgSz w:w="11906" w:h="16838"/>
       <w:pgMar w:top="1535" w:right="1701" w:bottom="1417" w:left="1701" w:header="567" w:footer="572" w:gutter="0"/>
       <w:pgNumType w:start="1"/>
@@ -16160,7 +16535,6 @@
   <w:style w:type="character" w:default="1" w:styleId="Fuentedeprrafopredeter">
     <w:name w:val="Default Paragraph Font"/>
     <w:uiPriority w:val="1"/>
-    <w:semiHidden/>
     <w:unhideWhenUsed/>
   </w:style>
   <w:style w:type="table" w:default="1" w:styleId="Tablanormal">

</xml_diff>

<commit_message>
Docs: Se mejoró el esquema lógico del Modelo de Datos
</commit_message>
<xml_diff>
--- a/03-Elaboración II/Modelo de Datos/Modelo de Datos_MetricFlow SQA_CoDevIT.docx
+++ b/03-Elaboración II/Modelo de Datos/Modelo de Datos_MetricFlow SQA_CoDevIT.docx
@@ -13941,9 +13941,9 @@
           <w:shd w:val="clear" w:color="auto" w:fill="FFFF00"/>
         </w:rPr>
         <w:drawing>
-          <wp:inline distT="0" distB="0" distL="0" distR="0" wp14:anchorId="7EA18ECB" wp14:editId="16EFECD2">
-            <wp:extent cx="6038850" cy="3000375"/>
-            <wp:effectExtent l="0" t="0" r="0" b="9525"/>
+          <wp:inline distT="0" distB="0" distL="0" distR="0" wp14:anchorId="7EA18ECB" wp14:editId="01EA975B">
+            <wp:extent cx="6184900" cy="2604961"/>
+            <wp:effectExtent l="0" t="0" r="6350" b="5080"/>
             <wp:docPr id="8" name="Imagen 8"/>
             <wp:cNvGraphicFramePr>
               <a:graphicFrameLocks xmlns:a="http://schemas.openxmlformats.org/drawingml/2006/main" noChangeAspect="1"/>
@@ -13952,20 +13952,19 @@
               <a:graphicData uri="http://schemas.openxmlformats.org/drawingml/2006/picture">
                 <pic:pic xmlns:pic="http://schemas.openxmlformats.org/drawingml/2006/picture">
                   <pic:nvPicPr>
-                    <pic:cNvPr id="0" name="Picture 8"/>
+                    <pic:cNvPr id="8" name="Imagen 8"/>
                     <pic:cNvPicPr>
                       <a:picLocks noChangeAspect="1" noChangeArrowheads="1"/>
                     </pic:cNvPicPr>
                   </pic:nvPicPr>
                   <pic:blipFill>
-                    <a:blip r:embed="rId14">
+                    <a:blip r:embed="rId14" cstate="print">
                       <a:extLst>
                         <a:ext uri="{28A0092B-C50C-407E-A947-70E740481C1C}">
                           <a14:useLocalDpi xmlns:a14="http://schemas.microsoft.com/office/drawing/2010/main" val="0"/>
                         </a:ext>
                       </a:extLst>
                     </a:blip>
-                    <a:srcRect/>
                     <a:stretch>
                       <a:fillRect/>
                     </a:stretch>
@@ -13973,7 +13972,7 @@
                   <pic:spPr bwMode="auto">
                     <a:xfrm>
                       <a:off x="0" y="0"/>
-                      <a:ext cx="6038850" cy="3000375"/>
+                      <a:ext cx="6191805" cy="2607869"/>
                     </a:xfrm>
                     <a:prstGeom prst="rect">
                       <a:avLst/>
@@ -14435,7 +14434,7 @@
                       </a:xfrm>
                     </wpg:grpSpPr>
                     <wpg:grpSp>
-                      <wpg:cNvPr id="11" name="Grupo 10"/>
+                      <wpg:cNvPr id="15" name="Grupo 10"/>
                       <wpg:cNvGrpSpPr/>
                       <wpg:grpSpPr>
                         <a:xfrm>
@@ -14446,7 +14445,7 @@
                         </a:xfrm>
                       </wpg:grpSpPr>
                       <wps:wsp>
-                        <wps:cNvPr id="13" name="Rectángulo 11"/>
+                        <wps:cNvPr id="16" name="Rectángulo 11"/>
                         <wps:cNvSpPr/>
                         <wps:spPr>
                           <a:xfrm>
@@ -14477,7 +14476,7 @@
                         </wps:bodyPr>
                       </wps:wsp>
                       <wpg:grpSp>
-                        <wpg:cNvPr id="14" name="Grupo 13"/>
+                        <wpg:cNvPr id="17" name="Grupo 13"/>
                         <wpg:cNvGrpSpPr/>
                         <wpg:grpSpPr>
                           <a:xfrm rot="10800000" flipH="1">
@@ -14488,7 +14487,7 @@
                           </a:xfrm>
                         </wpg:grpSpPr>
                         <wps:wsp>
-                          <wps:cNvPr id="15" name="Rectángulo 14"/>
+                          <wps:cNvPr id="18" name="Rectángulo 14"/>
                           <wps:cNvSpPr/>
                           <wps:spPr>
                             <a:xfrm>
@@ -14519,7 +14518,7 @@
                           </wps:bodyPr>
                         </wps:wsp>
                         <wps:wsp>
-                          <wps:cNvPr id="16" name="Conector recto de flecha 15"/>
+                          <wps:cNvPr id="19" name="Conector recto de flecha 15"/>
                           <wps:cNvCnPr/>
                           <wps:spPr>
                             <a:xfrm>
@@ -14543,7 +14542,7 @@
                           <wps:bodyPr/>
                         </wps:wsp>
                         <wps:wsp>
-                          <wps:cNvPr id="17" name="Rectángulo 16"/>
+                          <wps:cNvPr id="20" name="Rectángulo 16"/>
                           <wps:cNvSpPr/>
                           <wps:spPr>
                             <a:xfrm>
@@ -14583,9 +14582,9 @@
         </mc:Choice>
         <mc:Fallback>
           <w:pict>
-            <v:group w14:anchorId="034BEE5F" id="Grupo 73" o:spid="_x0000_s1044" style="position:absolute;left:0;text-align:left;margin-left:-84.75pt;margin-top:-.05pt;width:594pt;height:63.75pt;z-index:251663360" coordorigin="15741,33751" coordsize="75438,8096" o:gfxdata="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">
-              <v:group id="Grupo 10" o:spid="_x0000_s1045" style="position:absolute;left:15741;top:33751;width:75438;height:8097" coordorigin="15760,33751" coordsize="75400,8096" o:gfxdata="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">
-                <v:rect id="Rectángulo 11" o:spid="_x0000_s1046" style="position:absolute;left:15760;top:33751;width:75400;height:8097;visibility:visible;mso-wrap-style:square;v-text-anchor:middle" o:gfxdata="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" filled="f" stroked="f">
+            <v:group w14:anchorId="034BEE5F" id="Grupo 73" o:spid="_x0000_s1044" style="position:absolute;left:0;text-align:left;margin-left:-84.75pt;margin-top:-.05pt;width:594pt;height:63.75pt;z-index:251663360" coordorigin="15741,33751" coordsize="75438,8096" o:gfxdata="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">
+              <v:group id="Grupo 10" o:spid="_x0000_s1045" style="position:absolute;left:15741;top:33751;width:75438;height:8097" coordorigin="15760,33751" coordsize="75400,8096" o:gfxdata="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">
+                <v:rect id="Rectángulo 11" o:spid="_x0000_s1046" style="position:absolute;left:15760;top:33751;width:75400;height:8097;visibility:visible;mso-wrap-style:square;v-text-anchor:middle" o:gfxdata="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" filled="f" stroked="f">
                   <v:textbox inset="2.53958mm,2.53958mm,2.53958mm,2.53958mm">
                     <w:txbxContent>
                       <w:p>
@@ -14598,8 +14597,8 @@
                     </w:txbxContent>
                   </v:textbox>
                 </v:rect>
-                <v:group id="Grupo 13" o:spid="_x0000_s1047" style="position:absolute;left:15760;top:33751;width:75399;height:8097;rotation:180;flip:x" coordorigin="8,9" coordsize="15823,1439" o:gfxdata="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">
-                  <v:rect id="Rectángulo 14" o:spid="_x0000_s1048" style="position:absolute;left:8;top:9;width:15800;height:1425;visibility:visible;mso-wrap-style:square;v-text-anchor:middle" o:gfxdata="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" filled="f" stroked="f">
+                <v:group id="Grupo 13" o:spid="_x0000_s1047" style="position:absolute;left:15760;top:33751;width:75399;height:8097;rotation:180;flip:x" coordorigin="8,9" coordsize="15823,1439" o:gfxdata="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">
+                  <v:rect id="Rectángulo 14" o:spid="_x0000_s1048" style="position:absolute;left:8;top:9;width:15800;height:1425;visibility:visible;mso-wrap-style:square;v-text-anchor:middle" o:gfxdata="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" filled="f" stroked="f">
                     <v:textbox inset="2.53958mm,2.53958mm,2.53958mm,2.53958mm">
                       <w:txbxContent>
                         <w:p>
@@ -14616,10 +14615,10 @@
                     <v:path arrowok="t" fillok="f" o:connecttype="none"/>
                     <o:lock v:ext="edit" shapetype="t"/>
                   </v:shapetype>
-                  <v:shape id="Conector recto de flecha 15" o:spid="_x0000_s1049" type="#_x0000_t32" style="position:absolute;left:9;top:1431;width:15822;height:0;visibility:visible;mso-wrap-style:square" o:connectortype="straight" o:gfxdata="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" strokecolor="#31849b">
+                  <v:shape id="Conector recto de flecha 15" o:spid="_x0000_s1049" type="#_x0000_t32" style="position:absolute;left:9;top:1431;width:15822;height:0;visibility:visible;mso-wrap-style:square" o:connectortype="straight" o:gfxdata="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" strokecolor="#31849b">
                     <v:stroke startarrowwidth="narrow" startarrowlength="short" endarrowwidth="narrow" endarrowlength="short"/>
                   </v:shape>
-                  <v:rect id="Rectángulo 16" o:spid="_x0000_s1050" style="position:absolute;left:8;top:9;width:4031;height:1439;visibility:visible;mso-wrap-style:square;v-text-anchor:middle" o:gfxdata="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" filled="f" stroked="f">
+                  <v:rect id="Rectángulo 16" o:spid="_x0000_s1050" style="position:absolute;left:8;top:9;width:4031;height:1439;visibility:visible;mso-wrap-style:square;v-text-anchor:middle" o:gfxdata="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" filled="f" stroked="f">
                     <v:textbox inset="2.53958mm,2.53958mm,2.53958mm,2.53958mm">
                       <w:txbxContent>
                         <w:p>
@@ -14907,7 +14906,7 @@
                       </a:xfrm>
                     </wpg:grpSpPr>
                     <wpg:grpSp>
-                      <wpg:cNvPr id="5" name="Grupo 4"/>
+                      <wpg:cNvPr id="4" name="Grupo 4"/>
                       <wpg:cNvGrpSpPr/>
                       <wpg:grpSpPr>
                         <a:xfrm>
@@ -14918,7 +14917,7 @@
                         </a:xfrm>
                       </wpg:grpSpPr>
                       <wps:wsp>
-                        <wps:cNvPr id="6" name="Rectángulo 5"/>
+                        <wps:cNvPr id="9" name="Rectángulo 5"/>
                         <wps:cNvSpPr/>
                         <wps:spPr>
                           <a:xfrm>
@@ -14949,7 +14948,7 @@
                         </wps:bodyPr>
                       </wps:wsp>
                       <wpg:grpSp>
-                        <wpg:cNvPr id="7" name="Grupo 6"/>
+                        <wpg:cNvPr id="10" name="Grupo 6"/>
                         <wpg:cNvGrpSpPr/>
                         <wpg:grpSpPr>
                           <a:xfrm>
@@ -14960,7 +14959,7 @@
                           </a:xfrm>
                         </wpg:grpSpPr>
                         <wps:wsp>
-                          <wps:cNvPr id="8" name="Rectángulo 7"/>
+                          <wps:cNvPr id="11" name="Rectángulo 7"/>
                           <wps:cNvSpPr/>
                           <wps:spPr>
                             <a:xfrm>
@@ -14991,7 +14990,7 @@
                           </wps:bodyPr>
                         </wps:wsp>
                         <wps:wsp>
-                          <wps:cNvPr id="9" name="Conector recto de flecha 8"/>
+                          <wps:cNvPr id="13" name="Conector recto de flecha 8"/>
                           <wps:cNvCnPr/>
                           <wps:spPr>
                             <a:xfrm>
@@ -15015,7 +15014,7 @@
                           <wps:bodyPr/>
                         </wps:wsp>
                         <wps:wsp>
-                          <wps:cNvPr id="10" name="Rectángulo 9"/>
+                          <wps:cNvPr id="14" name="Rectángulo 9"/>
                           <wps:cNvSpPr/>
                           <wps:spPr>
                             <a:xfrm>
@@ -15055,9 +15054,9 @@
         </mc:Choice>
         <mc:Fallback>
           <w:pict>
-            <v:group w14:anchorId="56E246F8" id="Grupo 65" o:spid="_x0000_s1035" style="position:absolute;margin-left:1pt;margin-top:1.5pt;width:593.25pt;height:63pt;z-index:251658240;mso-position-horizontal-relative:page;mso-position-vertical-relative:page" coordorigin="15788,33799" coordsize="75343,8001" o:gfxdata="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">
-              <v:group id="Grupo 4" o:spid="_x0000_s1036" style="position:absolute;left:15788;top:33799;width:75343;height:8001" coordorigin="15772,33723" coordsize="75374,8153" o:gfxdata="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">
-                <v:rect id="Rectángulo 5" o:spid="_x0000_s1037" style="position:absolute;left:15772;top:33723;width:75375;height:8153;visibility:visible;mso-wrap-style:square;v-text-anchor:middle" o:gfxdata="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" filled="f" stroked="f">
+            <v:group w14:anchorId="56E246F8" id="Grupo 65" o:spid="_x0000_s1035" style="position:absolute;margin-left:1pt;margin-top:1.5pt;width:593.25pt;height:63pt;z-index:251658240;mso-position-horizontal-relative:page;mso-position-vertical-relative:page" coordorigin="15788,33799" coordsize="75343,8001" o:gfxdata="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">
+              <v:group id="Grupo 4" o:spid="_x0000_s1036" style="position:absolute;left:15788;top:33799;width:75343;height:8001" coordorigin="15772,33723" coordsize="75374,8153" o:gfxdata="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">
+                <v:rect id="Rectángulo 5" o:spid="_x0000_s1037" style="position:absolute;left:15772;top:33723;width:75375;height:8153;visibility:visible;mso-wrap-style:square;v-text-anchor:middle" o:gfxdata="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" filled="f" stroked="f">
                   <v:textbox inset="2.53958mm,2.53958mm,2.53958mm,2.53958mm">
                     <w:txbxContent>
                       <w:p>
@@ -15070,8 +15069,8 @@
                     </w:txbxContent>
                   </v:textbox>
                 </v:rect>
-                <v:group id="Grupo 6" o:spid="_x0000_s1038" style="position:absolute;left:15772;top:33723;width:75375;height:8153" coordorigin="8,9" coordsize="15823,1439" o:gfxdata="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">
-                  <v:rect id="Rectángulo 7" o:spid="_x0000_s1039" style="position:absolute;left:8;top:9;width:15800;height:1425;visibility:visible;mso-wrap-style:square;v-text-anchor:middle" o:gfxdata="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" filled="f" stroked="f">
+                <v:group id="Grupo 6" o:spid="_x0000_s1038" style="position:absolute;left:15772;top:33723;width:75375;height:8153" coordorigin="8,9" coordsize="15823,1439" o:gfxdata="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">
+                  <v:rect id="Rectángulo 7" o:spid="_x0000_s1039" style="position:absolute;left:8;top:9;width:15800;height:1425;visibility:visible;mso-wrap-style:square;v-text-anchor:middle" o:gfxdata="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" filled="f" stroked="f">
                     <v:textbox inset="2.53958mm,2.53958mm,2.53958mm,2.53958mm">
                       <w:txbxContent>
                         <w:p>
@@ -15088,10 +15087,10 @@
                     <v:path arrowok="t" fillok="f" o:connecttype="none"/>
                     <o:lock v:ext="edit" shapetype="t"/>
                   </v:shapetype>
-                  <v:shape id="Conector recto de flecha 8" o:spid="_x0000_s1040" type="#_x0000_t32" style="position:absolute;left:9;top:1431;width:15822;height:0;visibility:visible;mso-wrap-style:square" o:connectortype="straight" o:gfxdata="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" strokecolor="#31849b">
+                  <v:shape id="Conector recto de flecha 8" o:spid="_x0000_s1040" type="#_x0000_t32" style="position:absolute;left:9;top:1431;width:15822;height:0;visibility:visible;mso-wrap-style:square" o:connectortype="straight" o:gfxdata="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" strokecolor="#31849b">
                     <v:stroke startarrowwidth="narrow" startarrowlength="short" endarrowwidth="narrow" endarrowlength="short"/>
                   </v:shape>
-                  <v:rect id="Rectángulo 9" o:spid="_x0000_s1041" style="position:absolute;left:8;top:9;width:4031;height:1439;visibility:visible;mso-wrap-style:square;v-text-anchor:middle" o:gfxdata="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" filled="f" stroked="f">
+                  <v:rect id="Rectángulo 9" o:spid="_x0000_s1041" style="position:absolute;left:8;top:9;width:4031;height:1439;visibility:visible;mso-wrap-style:square;v-text-anchor:middle" o:gfxdata="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" filled="f" stroked="f">
                     <v:textbox inset="2.53958mm,2.53958mm,2.53958mm,2.53958mm">
                       <w:txbxContent>
                         <w:p>

</xml_diff>